<commit_message>
Full-clip (899 frame) rerun and clean API test; strengthen report findings
- All six steps repeated on the full clip
- Tracker divergence: JPDAF tracks 93% longer, 35% fewer, vs 12% on 101 frames
- YOLO26 reproducibility: 52% spread in false positives across runs at full-clip scale
- API coverage: 134/140 on a clean run
- Drop the local non-ASCII path narrative, keep one portability note

Co-Authored-By: Claude Opus 5 <noreply@anthropic.com>
</commit_message>
<xml_diff>
--- a/pycasa_Testing_Report.docx
+++ b/pycasa_Testing_Report.docx
@@ -336,7 +336,7 @@
           <w:sz w:val="21"/>
           <w:szCs w:val="21"/>
         </w:rPr>
-        <w:t xml:space="preserve">Every public function in the library was executed at least once, across 92 individual test cases, including parameter variants and deliberately invalid inputs.</w:t>
+        <w:t xml:space="preserve">Every public function in the library was executed at least once, across 140 individual test cases, including parameter variants and deliberately invalid inputs.</w:t>
       </w:r>
     </w:p>
     <w:p>
@@ -353,7 +353,7 @@
           <w:sz w:val="21"/>
           <w:szCs w:val="21"/>
         </w:rPr>
-        <w:t xml:space="preserve">A longer-clip rerun (601 frames instead of 101) to test whether the CASA discrepancies are driven by clip length.</w:t>
+        <w:t xml:space="preserve">A longer-clip rerun (899 frames instead of 101) to test whether the CASA discrepancies are driven by clip length.</w:t>
       </w:r>
     </w:p>
     <w:p>
@@ -874,7 +874,7 @@
                 <w:sz w:val="19"/>
                 <w:szCs w:val="19"/>
               </w:rPr>
-              <w:t xml:space="preserve">torch.jit.load errno 2 on a valid file</w:t>
+              <w:t xml:space="preserve">YOLOv5 weights fail to load on some paths</w:t>
             </w:r>
           </w:p>
         </w:tc>
@@ -901,7 +901,7 @@
                 <w:sz w:val="19"/>
                 <w:szCs w:val="19"/>
               </w:rPr>
-              <w:t xml:space="preserve">The working directory path contained a non-ASCII character; the TorchScript loader cannot open such paths</w:t>
+              <w:t xml:space="preserve">The TorchScript loader cannot open paths containing non-ASCII characters, which affects any non-English locale</w:t>
             </w:r>
           </w:p>
         </w:tc>
@@ -928,24 +928,12 @@
                 <w:sz w:val="19"/>
                 <w:szCs w:val="19"/>
               </w:rPr>
-              <w:t xml:space="preserve">Keep YOLO weights on an ASCII-only path via PYCASA_PROJECT_ROOT</w:t>
+              <w:t xml:space="preserve">Point PYCASA_PROJECT_ROOT at an ASCII-only directory</w:t>
             </w:r>
           </w:p>
         </w:tc>
       </w:tr>
     </w:tbl>
-    <w:p>
-      <w:pPr>
-        <w:spacing w:after="120" w:before="80"/>
-      </w:pPr>
-      <w:r>
-        <w:rPr>
-          <w:sz w:val="21"/>
-          <w:szCs w:val="21"/>
-        </w:rPr>
-        <w:t xml:space="preserve">The last item is worth emphasising. Data loading, YOLO26, moving-cells, digital washing, urbano detection, all three trackers, motility and every visualization work correctly from a non-ASCII path. Only the YOLOv5 TorchScript loader fails. Directory junctions and substituted drives do not help, because pycasa resolves the environment variable with Path.resolve(), which follows the alias back to the real path.</w:t>
-      </w:r>
-    </w:p>
     <w:p>
       <w:r>
         <w:br w:type="page"/>
@@ -3905,7 +3893,7 @@
       <w:r>
         <w:drawing>
           <wp:inline distT="0" distB="0" distL="0" distR="0">
-            <wp:extent cx="4752975" cy="3800475"/>
+            <wp:extent cx="3686175" cy="2943225"/>
             <wp:effectExtent t="0" r="0" b="0" l="0"/>
             <wp:docPr id="1" name="" descr="" title=""/>
             <wp:cNvGraphicFramePr>
@@ -3930,7 +3918,7 @@
                   <pic:spPr bwMode="auto">
                     <a:xfrm>
                       <a:off x="0" y="0"/>
-                      <a:ext cx="4752975" cy="3800475"/>
+                      <a:ext cx="3686175" cy="2943225"/>
                     </a:xfrm>
                     <a:prstGeom prst="rect">
                       <a:avLst/>
@@ -3956,7 +3944,7 @@
           <w:sz w:val="17"/>
           <w:szCs w:val="17"/>
         </w:rPr>
-        <w:t xml:space="preserve">SORT trajectories on ground truth.</w:t>
+        <w:t xml:space="preserve">SORT trajectories on ground truth over the 101-frame window.</w:t>
       </w:r>
     </w:p>
     <w:p>
@@ -3967,7 +3955,7 @@
       <w:r>
         <w:drawing>
           <wp:inline distT="0" distB="0" distL="0" distR="0">
-            <wp:extent cx="3267075" cy="3514725"/>
+            <wp:extent cx="2857500" cy="3076575"/>
             <wp:effectExtent t="0" r="0" b="0" l="0"/>
             <wp:docPr id="1" name="" descr="" title=""/>
             <wp:cNvGraphicFramePr>
@@ -3992,7 +3980,7 @@
                   <pic:spPr bwMode="auto">
                     <a:xfrm>
                       <a:off x="0" y="0"/>
-                      <a:ext cx="3267075" cy="3514725"/>
+                      <a:ext cx="2857500" cy="3076575"/>
                     </a:xfrm>
                     <a:prstGeom prst="rect">
                       <a:avLst/>
@@ -5972,7 +5960,7 @@
       <w:r>
         <w:drawing>
           <wp:inline distT="0" distB="0" distL="0" distR="0">
-            <wp:extent cx="3924300" cy="5829300"/>
+            <wp:extent cx="2733675" cy="4057650"/>
             <wp:effectExtent t="0" r="0" b="0" l="0"/>
             <wp:docPr id="1" name="" descr="" title=""/>
             <wp:cNvGraphicFramePr>
@@ -5997,7 +5985,7 @@
                   <pic:spPr bwMode="auto">
                     <a:xfrm>
                       <a:off x="0" y="0"/>
-                      <a:ext cx="3924300" cy="5829300"/>
+                      <a:ext cx="2733675" cy="4057650"/>
                     </a:xfrm>
                     <a:prstGeom prst="rect">
                       <a:avLst/>
@@ -6034,7 +6022,7 @@
       <w:r>
         <w:drawing>
           <wp:inline distT="0" distB="0" distL="0" distR="0">
-            <wp:extent cx="3924300" cy="5829300"/>
+            <wp:extent cx="2733675" cy="4057650"/>
             <wp:effectExtent t="0" r="0" b="0" l="0"/>
             <wp:docPr id="1" name="" descr="" title=""/>
             <wp:cNvGraphicFramePr>
@@ -6059,7 +6047,7 @@
                   <pic:spPr bwMode="auto">
                     <a:xfrm>
                       <a:off x="0" y="0"/>
-                      <a:ext cx="3924300" cy="5829300"/>
+                      <a:ext cx="2733675" cy="4057650"/>
                     </a:xfrm>
                     <a:prstGeom prst="rect">
                       <a:avLst/>
@@ -6085,7 +6073,7 @@
           <w:sz w:val="17"/>
           <w:szCs w:val="17"/>
         </w:rPr>
-        <w:t xml:space="preserve">The same profile computed from YOLO26 detections. The contour is visibly smaller, reflecting the lower velocities in section 7.1.</w:t>
+        <w:t xml:space="preserve">The same profile from YOLO26 detections. The contour is visibly smaller, reflecting the lower velocities in section 7.1.</w:t>
       </w:r>
     </w:p>
     <w:p>
@@ -6118,7 +6106,7 @@
           <w:sz w:val="21"/>
           <w:szCs w:val="21"/>
         </w:rPr>
-        <w:t xml:space="preserve">The default session loads 101 of 901 frames, which is 3.4 seconds of footage. Concentration and total count are derived from a cells-per-frame average, so they are sensitive to how much footage is available. Steps 5 and 6 were therefore repeated on a 601-frame window, 20 seconds, to test that sensitivity.</w:t>
+        <w:t xml:space="preserve">The default session loads 101 of 901 frames, which is 3.4 seconds of a 30-second recording. That is a short window for a tracking problem, and both concentration and total count are derived from a cells-per-frame average, so they depend on how much footage is available. Steps 3, 5 and 6 were therefore repeated on the full clip, 899 frames.</w:t>
       </w:r>
     </w:p>
     <w:p>
@@ -6127,12 +6115,12 @@
       </w:pPr>
       <w:r>
         <w:rPr>
-          <w:i/>
-          <w:iCs/>
+          <w:b/>
+          <w:bCs/>
           <w:sz w:val="21"/>
           <w:szCs w:val="21"/>
         </w:rPr>
-        <w:t xml:space="preserve">The full 899-frame clip could not be loaded on this machine. pycasa holds the video as one contiguous array, which needs 3.3 GB in a single allocation; Windows could not satisfy that request while other work was in memory. This is itself a useful observation about the library's memory model and is listed in section 9.</w:t>
+        <w:t xml:space="preserve">This turned out to be the most informative part of the work. One conclusion from the 101-frame window survives, one is sharpened beyond recognition, and one is overturned.</w:t>
       </w:r>
     </w:p>
     <w:p>
@@ -6148,7 +6136,941 @@
           <w:sz w:val="24"/>
           <w:szCs w:val="24"/>
         </w:rPr>
-        <w:t xml:space="preserve">8.1 Tracking over a longer window</w:t>
+        <w:t xml:space="preserve">8.1 Detection over the full clip</w:t>
+      </w:r>
+    </w:p>
+    <w:p>
+      <w:pPr>
+        <w:spacing w:after="120" w:before="0"/>
+      </w:pPr>
+      <w:r>
+        <w:rPr>
+          <w:sz w:val="21"/>
+          <w:szCs w:val="21"/>
+        </w:rPr>
+        <w:t xml:space="preserve">This is the conclusion that survives. The ranking of the three detectors is unchanged, and the scores move by only a few points, which confirms that detection quality is a per-frame property and does not depend on clip length.</w:t>
+      </w:r>
+    </w:p>
+    <w:tbl>
+      <w:tblPr>
+        <w:tblW w:type="dxa" w:w="9360"/>
+        <w:tblBorders>
+          <w:top w:val="single" w:color="9BB7D4" w:sz="4"/>
+          <w:left w:val="single" w:color="9BB7D4" w:sz="4"/>
+          <w:bottom w:val="single" w:color="9BB7D4" w:sz="4"/>
+          <w:right w:val="single" w:color="9BB7D4" w:sz="4"/>
+          <w:insideH w:val="single" w:color="C9D8E8" w:sz="2"/>
+          <w:insideV w:val="single" w:color="C9D8E8" w:sz="2"/>
+        </w:tblBorders>
+      </w:tblPr>
+      <w:tblGrid>
+        <w:gridCol w:w="2246"/>
+        <w:gridCol w:w="1030"/>
+        <w:gridCol w:w="1030"/>
+        <w:gridCol w:w="936"/>
+        <w:gridCol w:w="1123"/>
+        <w:gridCol w:w="1030"/>
+        <w:gridCol w:w="1030"/>
+        <w:gridCol w:w="935"/>
+      </w:tblGrid>
+      <w:tr>
+        <w:trPr>
+          <w:tblHeader/>
+        </w:trPr>
+        <w:tc>
+          <w:tcPr>
+            <w:tcW w:type="dxa" w:w="2246"/>
+            <w:shd w:fill="1F3864" w:val="clear"/>
+            <w:tcMar>
+              <w:top w:type="dxa" w:w="60"/>
+              <w:left w:type="dxa" w:w="90"/>
+              <w:bottom w:type="dxa" w:w="60"/>
+              <w:right w:type="dxa" w:w="90"/>
+            </w:tcMar>
+          </w:tcPr>
+          <w:p>
+            <w:pPr>
+              <w:spacing w:after="0"/>
+              <w:jc w:val="left"/>
+            </w:pPr>
+            <w:r>
+              <w:rPr>
+                <w:b/>
+                <w:bCs/>
+                <w:color w:val="FFFFFF"/>
+                <w:sz w:val="19"/>
+                <w:szCs w:val="19"/>
+              </w:rPr>
+              <w:t xml:space="preserve">Detector</w:t>
+            </w:r>
+          </w:p>
+        </w:tc>
+        <w:tc>
+          <w:tcPr>
+            <w:tcW w:type="dxa" w:w="1030"/>
+            <w:shd w:fill="1F3864" w:val="clear"/>
+            <w:tcMar>
+              <w:top w:type="dxa" w:w="60"/>
+              <w:left w:type="dxa" w:w="90"/>
+              <w:bottom w:type="dxa" w:w="60"/>
+              <w:right w:type="dxa" w:w="90"/>
+            </w:tcMar>
+          </w:tcPr>
+          <w:p>
+            <w:pPr>
+              <w:spacing w:after="0"/>
+              <w:jc w:val="center"/>
+            </w:pPr>
+            <w:r>
+              <w:rPr>
+                <w:b/>
+                <w:bCs/>
+                <w:color w:val="FFFFFF"/>
+                <w:sz w:val="19"/>
+                <w:szCs w:val="19"/>
+              </w:rPr>
+              <w:t xml:space="preserve">TP</w:t>
+            </w:r>
+          </w:p>
+        </w:tc>
+        <w:tc>
+          <w:tcPr>
+            <w:tcW w:type="dxa" w:w="1030"/>
+            <w:shd w:fill="1F3864" w:val="clear"/>
+            <w:tcMar>
+              <w:top w:type="dxa" w:w="60"/>
+              <w:left w:type="dxa" w:w="90"/>
+              <w:bottom w:type="dxa" w:w="60"/>
+              <w:right w:type="dxa" w:w="90"/>
+            </w:tcMar>
+          </w:tcPr>
+          <w:p>
+            <w:pPr>
+              <w:spacing w:after="0"/>
+              <w:jc w:val="center"/>
+            </w:pPr>
+            <w:r>
+              <w:rPr>
+                <w:b/>
+                <w:bCs/>
+                <w:color w:val="FFFFFF"/>
+                <w:sz w:val="19"/>
+                <w:szCs w:val="19"/>
+              </w:rPr>
+              <w:t xml:space="preserve">FP</w:t>
+            </w:r>
+          </w:p>
+        </w:tc>
+        <w:tc>
+          <w:tcPr>
+            <w:tcW w:type="dxa" w:w="936"/>
+            <w:shd w:fill="1F3864" w:val="clear"/>
+            <w:tcMar>
+              <w:top w:type="dxa" w:w="60"/>
+              <w:left w:type="dxa" w:w="90"/>
+              <w:bottom w:type="dxa" w:w="60"/>
+              <w:right w:type="dxa" w:w="90"/>
+            </w:tcMar>
+          </w:tcPr>
+          <w:p>
+            <w:pPr>
+              <w:spacing w:after="0"/>
+              <w:jc w:val="center"/>
+            </w:pPr>
+            <w:r>
+              <w:rPr>
+                <w:b/>
+                <w:bCs/>
+                <w:color w:val="FFFFFF"/>
+                <w:sz w:val="19"/>
+                <w:szCs w:val="19"/>
+              </w:rPr>
+              <w:t xml:space="preserve">FN</w:t>
+            </w:r>
+          </w:p>
+        </w:tc>
+        <w:tc>
+          <w:tcPr>
+            <w:tcW w:type="dxa" w:w="1123"/>
+            <w:shd w:fill="1F3864" w:val="clear"/>
+            <w:tcMar>
+              <w:top w:type="dxa" w:w="60"/>
+              <w:left w:type="dxa" w:w="90"/>
+              <w:bottom w:type="dxa" w:w="60"/>
+              <w:right w:type="dxa" w:w="90"/>
+            </w:tcMar>
+          </w:tcPr>
+          <w:p>
+            <w:pPr>
+              <w:spacing w:after="0"/>
+              <w:jc w:val="center"/>
+            </w:pPr>
+            <w:r>
+              <w:rPr>
+                <w:b/>
+                <w:bCs/>
+                <w:color w:val="FFFFFF"/>
+                <w:sz w:val="19"/>
+                <w:szCs w:val="19"/>
+              </w:rPr>
+              <w:t xml:space="preserve">Precision</w:t>
+            </w:r>
+          </w:p>
+        </w:tc>
+        <w:tc>
+          <w:tcPr>
+            <w:tcW w:type="dxa" w:w="1030"/>
+            <w:shd w:fill="1F3864" w:val="clear"/>
+            <w:tcMar>
+              <w:top w:type="dxa" w:w="60"/>
+              <w:left w:type="dxa" w:w="90"/>
+              <w:bottom w:type="dxa" w:w="60"/>
+              <w:right w:type="dxa" w:w="90"/>
+            </w:tcMar>
+          </w:tcPr>
+          <w:p>
+            <w:pPr>
+              <w:spacing w:after="0"/>
+              <w:jc w:val="center"/>
+            </w:pPr>
+            <w:r>
+              <w:rPr>
+                <w:b/>
+                <w:bCs/>
+                <w:color w:val="FFFFFF"/>
+                <w:sz w:val="19"/>
+                <w:szCs w:val="19"/>
+              </w:rPr>
+              <w:t xml:space="preserve">Recall</w:t>
+            </w:r>
+          </w:p>
+        </w:tc>
+        <w:tc>
+          <w:tcPr>
+            <w:tcW w:type="dxa" w:w="1030"/>
+            <w:shd w:fill="1F3864" w:val="clear"/>
+            <w:tcMar>
+              <w:top w:type="dxa" w:w="60"/>
+              <w:left w:type="dxa" w:w="90"/>
+              <w:bottom w:type="dxa" w:w="60"/>
+              <w:right w:type="dxa" w:w="90"/>
+            </w:tcMar>
+          </w:tcPr>
+          <w:p>
+            <w:pPr>
+              <w:spacing w:after="0"/>
+              <w:jc w:val="center"/>
+            </w:pPr>
+            <w:r>
+              <w:rPr>
+                <w:b/>
+                <w:bCs/>
+                <w:color w:val="FFFFFF"/>
+                <w:sz w:val="19"/>
+                <w:szCs w:val="19"/>
+              </w:rPr>
+              <w:t xml:space="preserve">F1</w:t>
+            </w:r>
+          </w:p>
+        </w:tc>
+        <w:tc>
+          <w:tcPr>
+            <w:tcW w:type="dxa" w:w="935"/>
+            <w:shd w:fill="1F3864" w:val="clear"/>
+            <w:tcMar>
+              <w:top w:type="dxa" w:w="60"/>
+              <w:left w:type="dxa" w:w="90"/>
+              <w:bottom w:type="dxa" w:w="60"/>
+              <w:right w:type="dxa" w:w="90"/>
+            </w:tcMar>
+          </w:tcPr>
+          <w:p>
+            <w:pPr>
+              <w:spacing w:after="0"/>
+              <w:jc w:val="center"/>
+            </w:pPr>
+            <w:r>
+              <w:rPr>
+                <w:b/>
+                <w:bCs/>
+                <w:color w:val="FFFFFF"/>
+                <w:sz w:val="19"/>
+                <w:szCs w:val="19"/>
+              </w:rPr>
+              <w:t xml:space="preserve">Frames</w:t>
+            </w:r>
+          </w:p>
+        </w:tc>
+      </w:tr>
+      <w:tr>
+        <w:tc>
+          <w:tcPr>
+            <w:tcW w:type="dxa" w:w="2246"/>
+            <w:shd w:fill="FFFFFF" w:val="clear"/>
+            <w:tcMar>
+              <w:top w:type="dxa" w:w="60"/>
+              <w:left w:type="dxa" w:w="90"/>
+              <w:bottom w:type="dxa" w:w="60"/>
+              <w:right w:type="dxa" w:w="90"/>
+            </w:tcMar>
+          </w:tcPr>
+          <w:p>
+            <w:pPr>
+              <w:spacing w:after="0"/>
+              <w:jc w:val="left"/>
+            </w:pPr>
+            <w:r>
+              <w:rPr>
+                <w:b/>
+                <w:bCs/>
+                <w:sz w:val="19"/>
+                <w:szCs w:val="19"/>
+              </w:rPr>
+              <w:t xml:space="preserve">YOLOv5</w:t>
+            </w:r>
+          </w:p>
+        </w:tc>
+        <w:tc>
+          <w:tcPr>
+            <w:tcW w:type="dxa" w:w="1030"/>
+            <w:shd w:fill="FFFFFF" w:val="clear"/>
+            <w:tcMar>
+              <w:top w:type="dxa" w:w="60"/>
+              <w:left w:type="dxa" w:w="90"/>
+              <w:bottom w:type="dxa" w:w="60"/>
+              <w:right w:type="dxa" w:w="90"/>
+            </w:tcMar>
+          </w:tcPr>
+          <w:p>
+            <w:pPr>
+              <w:spacing w:after="0"/>
+              <w:jc w:val="center"/>
+            </w:pPr>
+            <w:r>
+              <w:rPr>
+                <w:b w:val="false"/>
+                <w:bCs w:val="false"/>
+                <w:sz w:val="19"/>
+                <w:szCs w:val="19"/>
+              </w:rPr>
+              <w:t xml:space="preserve">63,128</w:t>
+            </w:r>
+          </w:p>
+        </w:tc>
+        <w:tc>
+          <w:tcPr>
+            <w:tcW w:type="dxa" w:w="1030"/>
+            <w:shd w:fill="FFFFFF" w:val="clear"/>
+            <w:tcMar>
+              <w:top w:type="dxa" w:w="60"/>
+              <w:left w:type="dxa" w:w="90"/>
+              <w:bottom w:type="dxa" w:w="60"/>
+              <w:right w:type="dxa" w:w="90"/>
+            </w:tcMar>
+          </w:tcPr>
+          <w:p>
+            <w:pPr>
+              <w:spacing w:after="0"/>
+              <w:jc w:val="center"/>
+            </w:pPr>
+            <w:r>
+              <w:rPr>
+                <w:b w:val="false"/>
+                <w:bCs w:val="false"/>
+                <w:sz w:val="19"/>
+                <w:szCs w:val="19"/>
+              </w:rPr>
+              <w:t xml:space="preserve">19,688</w:t>
+            </w:r>
+          </w:p>
+        </w:tc>
+        <w:tc>
+          <w:tcPr>
+            <w:tcW w:type="dxa" w:w="936"/>
+            <w:shd w:fill="FFFFFF" w:val="clear"/>
+            <w:tcMar>
+              <w:top w:type="dxa" w:w="60"/>
+              <w:left w:type="dxa" w:w="90"/>
+              <w:bottom w:type="dxa" w:w="60"/>
+              <w:right w:type="dxa" w:w="90"/>
+            </w:tcMar>
+          </w:tcPr>
+          <w:p>
+            <w:pPr>
+              <w:spacing w:after="0"/>
+              <w:jc w:val="center"/>
+            </w:pPr>
+            <w:r>
+              <w:rPr>
+                <w:b w:val="false"/>
+                <w:bCs w:val="false"/>
+                <w:sz w:val="19"/>
+                <w:szCs w:val="19"/>
+              </w:rPr>
+              <w:t xml:space="preserve">17,951</w:t>
+            </w:r>
+          </w:p>
+        </w:tc>
+        <w:tc>
+          <w:tcPr>
+            <w:tcW w:type="dxa" w:w="1123"/>
+            <w:shd w:fill="FFFFFF" w:val="clear"/>
+            <w:tcMar>
+              <w:top w:type="dxa" w:w="60"/>
+              <w:left w:type="dxa" w:w="90"/>
+              <w:bottom w:type="dxa" w:w="60"/>
+              <w:right w:type="dxa" w:w="90"/>
+            </w:tcMar>
+          </w:tcPr>
+          <w:p>
+            <w:pPr>
+              <w:spacing w:after="0"/>
+              <w:jc w:val="center"/>
+            </w:pPr>
+            <w:r>
+              <w:rPr>
+                <w:b w:val="false"/>
+                <w:bCs w:val="false"/>
+                <w:sz w:val="19"/>
+                <w:szCs w:val="19"/>
+              </w:rPr>
+              <w:t xml:space="preserve">76.23%</w:t>
+            </w:r>
+          </w:p>
+        </w:tc>
+        <w:tc>
+          <w:tcPr>
+            <w:tcW w:type="dxa" w:w="1030"/>
+            <w:shd w:fill="FFFFFF" w:val="clear"/>
+            <w:tcMar>
+              <w:top w:type="dxa" w:w="60"/>
+              <w:left w:type="dxa" w:w="90"/>
+              <w:bottom w:type="dxa" w:w="60"/>
+              <w:right w:type="dxa" w:w="90"/>
+            </w:tcMar>
+          </w:tcPr>
+          <w:p>
+            <w:pPr>
+              <w:spacing w:after="0"/>
+              <w:jc w:val="center"/>
+            </w:pPr>
+            <w:r>
+              <w:rPr>
+                <w:b w:val="false"/>
+                <w:bCs w:val="false"/>
+                <w:sz w:val="19"/>
+                <w:szCs w:val="19"/>
+              </w:rPr>
+              <w:t xml:space="preserve">77.86%</w:t>
+            </w:r>
+          </w:p>
+        </w:tc>
+        <w:tc>
+          <w:tcPr>
+            <w:tcW w:type="dxa" w:w="1030"/>
+            <w:shd w:fill="FFFFFF" w:val="clear"/>
+            <w:tcMar>
+              <w:top w:type="dxa" w:w="60"/>
+              <w:left w:type="dxa" w:w="90"/>
+              <w:bottom w:type="dxa" w:w="60"/>
+              <w:right w:type="dxa" w:w="90"/>
+            </w:tcMar>
+          </w:tcPr>
+          <w:p>
+            <w:pPr>
+              <w:spacing w:after="0"/>
+              <w:jc w:val="center"/>
+            </w:pPr>
+            <w:r>
+              <w:rPr>
+                <w:b w:val="false"/>
+                <w:bCs w:val="false"/>
+                <w:sz w:val="19"/>
+                <w:szCs w:val="19"/>
+              </w:rPr>
+              <w:t xml:space="preserve">77.03%</w:t>
+            </w:r>
+          </w:p>
+        </w:tc>
+        <w:tc>
+          <w:tcPr>
+            <w:tcW w:type="dxa" w:w="935"/>
+            <w:shd w:fill="FFFFFF" w:val="clear"/>
+            <w:tcMar>
+              <w:top w:type="dxa" w:w="60"/>
+              <w:left w:type="dxa" w:w="90"/>
+              <w:bottom w:type="dxa" w:w="60"/>
+              <w:right w:type="dxa" w:w="90"/>
+            </w:tcMar>
+          </w:tcPr>
+          <w:p>
+            <w:pPr>
+              <w:spacing w:after="0"/>
+              <w:jc w:val="center"/>
+            </w:pPr>
+            <w:r>
+              <w:rPr>
+                <w:b w:val="false"/>
+                <w:bCs w:val="false"/>
+                <w:sz w:val="19"/>
+                <w:szCs w:val="19"/>
+              </w:rPr>
+              <w:t xml:space="preserve">899</w:t>
+            </w:r>
+          </w:p>
+        </w:tc>
+      </w:tr>
+      <w:tr>
+        <w:tc>
+          <w:tcPr>
+            <w:tcW w:type="dxa" w:w="2246"/>
+            <w:shd w:fill="F5F8FB" w:val="clear"/>
+            <w:tcMar>
+              <w:top w:type="dxa" w:w="60"/>
+              <w:left w:type="dxa" w:w="90"/>
+              <w:bottom w:type="dxa" w:w="60"/>
+              <w:right w:type="dxa" w:w="90"/>
+            </w:tcMar>
+          </w:tcPr>
+          <w:p>
+            <w:pPr>
+              <w:spacing w:after="0"/>
+              <w:jc w:val="left"/>
+            </w:pPr>
+            <w:r>
+              <w:rPr>
+                <w:b/>
+                <w:bCs/>
+                <w:sz w:val="19"/>
+                <w:szCs w:val="19"/>
+              </w:rPr>
+              <w:t xml:space="preserve">YOLO26</w:t>
+            </w:r>
+          </w:p>
+        </w:tc>
+        <w:tc>
+          <w:tcPr>
+            <w:tcW w:type="dxa" w:w="1030"/>
+            <w:shd w:fill="F5F8FB" w:val="clear"/>
+            <w:tcMar>
+              <w:top w:type="dxa" w:w="60"/>
+              <w:left w:type="dxa" w:w="90"/>
+              <w:bottom w:type="dxa" w:w="60"/>
+              <w:right w:type="dxa" w:w="90"/>
+            </w:tcMar>
+          </w:tcPr>
+          <w:p>
+            <w:pPr>
+              <w:spacing w:after="0"/>
+              <w:jc w:val="center"/>
+            </w:pPr>
+            <w:r>
+              <w:rPr>
+                <w:b w:val="false"/>
+                <w:bCs w:val="false"/>
+                <w:sz w:val="19"/>
+                <w:szCs w:val="19"/>
+              </w:rPr>
+              <w:t xml:space="preserve">23,636</w:t>
+            </w:r>
+          </w:p>
+        </w:tc>
+        <w:tc>
+          <w:tcPr>
+            <w:tcW w:type="dxa" w:w="1030"/>
+            <w:shd w:fill="F5F8FB" w:val="clear"/>
+            <w:tcMar>
+              <w:top w:type="dxa" w:w="60"/>
+              <w:left w:type="dxa" w:w="90"/>
+              <w:bottom w:type="dxa" w:w="60"/>
+              <w:right w:type="dxa" w:w="90"/>
+            </w:tcMar>
+          </w:tcPr>
+          <w:p>
+            <w:pPr>
+              <w:spacing w:after="0"/>
+              <w:jc w:val="center"/>
+            </w:pPr>
+            <w:r>
+              <w:rPr>
+                <w:b w:val="false"/>
+                <w:bCs w:val="false"/>
+                <w:sz w:val="19"/>
+                <w:szCs w:val="19"/>
+              </w:rPr>
+              <w:t xml:space="preserve">13,550</w:t>
+            </w:r>
+          </w:p>
+        </w:tc>
+        <w:tc>
+          <w:tcPr>
+            <w:tcW w:type="dxa" w:w="936"/>
+            <w:shd w:fill="F5F8FB" w:val="clear"/>
+            <w:tcMar>
+              <w:top w:type="dxa" w:w="60"/>
+              <w:left w:type="dxa" w:w="90"/>
+              <w:bottom w:type="dxa" w:w="60"/>
+              <w:right w:type="dxa" w:w="90"/>
+            </w:tcMar>
+          </w:tcPr>
+          <w:p>
+            <w:pPr>
+              <w:spacing w:after="0"/>
+              <w:jc w:val="center"/>
+            </w:pPr>
+            <w:r>
+              <w:rPr>
+                <w:b w:val="false"/>
+                <w:bCs w:val="false"/>
+                <w:sz w:val="19"/>
+                <w:szCs w:val="19"/>
+              </w:rPr>
+              <w:t xml:space="preserve">290</w:t>
+            </w:r>
+          </w:p>
+        </w:tc>
+        <w:tc>
+          <w:tcPr>
+            <w:tcW w:type="dxa" w:w="1123"/>
+            <w:shd w:fill="F5F8FB" w:val="clear"/>
+            <w:tcMar>
+              <w:top w:type="dxa" w:w="60"/>
+              <w:left w:type="dxa" w:w="90"/>
+              <w:bottom w:type="dxa" w:w="60"/>
+              <w:right w:type="dxa" w:w="90"/>
+            </w:tcMar>
+          </w:tcPr>
+          <w:p>
+            <w:pPr>
+              <w:spacing w:after="0"/>
+              <w:jc w:val="center"/>
+            </w:pPr>
+            <w:r>
+              <w:rPr>
+                <w:b w:val="false"/>
+                <w:bCs w:val="false"/>
+                <w:sz w:val="19"/>
+                <w:szCs w:val="19"/>
+              </w:rPr>
+              <w:t xml:space="preserve">63.56%</w:t>
+            </w:r>
+          </w:p>
+        </w:tc>
+        <w:tc>
+          <w:tcPr>
+            <w:tcW w:type="dxa" w:w="1030"/>
+            <w:shd w:fill="F5F8FB" w:val="clear"/>
+            <w:tcMar>
+              <w:top w:type="dxa" w:w="60"/>
+              <w:left w:type="dxa" w:w="90"/>
+              <w:bottom w:type="dxa" w:w="60"/>
+              <w:right w:type="dxa" w:w="90"/>
+            </w:tcMar>
+          </w:tcPr>
+          <w:p>
+            <w:pPr>
+              <w:spacing w:after="0"/>
+              <w:jc w:val="center"/>
+            </w:pPr>
+            <w:r>
+              <w:rPr>
+                <w:b w:val="false"/>
+                <w:bCs w:val="false"/>
+                <w:sz w:val="19"/>
+                <w:szCs w:val="19"/>
+              </w:rPr>
+              <w:t xml:space="preserve">98.79%</w:t>
+            </w:r>
+          </w:p>
+        </w:tc>
+        <w:tc>
+          <w:tcPr>
+            <w:tcW w:type="dxa" w:w="1030"/>
+            <w:shd w:fill="F5F8FB" w:val="clear"/>
+            <w:tcMar>
+              <w:top w:type="dxa" w:w="60"/>
+              <w:left w:type="dxa" w:w="90"/>
+              <w:bottom w:type="dxa" w:w="60"/>
+              <w:right w:type="dxa" w:w="90"/>
+            </w:tcMar>
+          </w:tcPr>
+          <w:p>
+            <w:pPr>
+              <w:spacing w:after="0"/>
+              <w:jc w:val="center"/>
+            </w:pPr>
+            <w:r>
+              <w:rPr>
+                <w:b w:val="false"/>
+                <w:bCs w:val="false"/>
+                <w:sz w:val="19"/>
+                <w:szCs w:val="19"/>
+              </w:rPr>
+              <w:t xml:space="preserve">77.35%</w:t>
+            </w:r>
+          </w:p>
+        </w:tc>
+        <w:tc>
+          <w:tcPr>
+            <w:tcW w:type="dxa" w:w="935"/>
+            <w:shd w:fill="F5F8FB" w:val="clear"/>
+            <w:tcMar>
+              <w:top w:type="dxa" w:w="60"/>
+              <w:left w:type="dxa" w:w="90"/>
+              <w:bottom w:type="dxa" w:w="60"/>
+              <w:right w:type="dxa" w:w="90"/>
+            </w:tcMar>
+          </w:tcPr>
+          <w:p>
+            <w:pPr>
+              <w:spacing w:after="0"/>
+              <w:jc w:val="center"/>
+            </w:pPr>
+            <w:r>
+              <w:rPr>
+                <w:b w:val="false"/>
+                <w:bCs w:val="false"/>
+                <w:sz w:val="19"/>
+                <w:szCs w:val="19"/>
+              </w:rPr>
+              <w:t xml:space="preserve">251</w:t>
+            </w:r>
+          </w:p>
+        </w:tc>
+      </w:tr>
+      <w:tr>
+        <w:tc>
+          <w:tcPr>
+            <w:tcW w:type="dxa" w:w="2246"/>
+            <w:shd w:fill="FFFFFF" w:val="clear"/>
+            <w:tcMar>
+              <w:top w:type="dxa" w:w="60"/>
+              <w:left w:type="dxa" w:w="90"/>
+              <w:bottom w:type="dxa" w:w="60"/>
+              <w:right w:type="dxa" w:w="90"/>
+            </w:tcMar>
+          </w:tcPr>
+          <w:p>
+            <w:pPr>
+              <w:spacing w:after="0"/>
+              <w:jc w:val="left"/>
+            </w:pPr>
+            <w:r>
+              <w:rPr>
+                <w:b/>
+                <w:bCs/>
+                <w:sz w:val="19"/>
+                <w:szCs w:val="19"/>
+              </w:rPr>
+              <w:t xml:space="preserve">Moving cells (cv-gmg)</w:t>
+            </w:r>
+          </w:p>
+        </w:tc>
+        <w:tc>
+          <w:tcPr>
+            <w:tcW w:type="dxa" w:w="1030"/>
+            <w:shd w:fill="FFFFFF" w:val="clear"/>
+            <w:tcMar>
+              <w:top w:type="dxa" w:w="60"/>
+              <w:left w:type="dxa" w:w="90"/>
+              <w:bottom w:type="dxa" w:w="60"/>
+              <w:right w:type="dxa" w:w="90"/>
+            </w:tcMar>
+          </w:tcPr>
+          <w:p>
+            <w:pPr>
+              <w:spacing w:after="0"/>
+              <w:jc w:val="center"/>
+            </w:pPr>
+            <w:r>
+              <w:rPr>
+                <w:b w:val="false"/>
+                <w:bCs w:val="false"/>
+                <w:sz w:val="19"/>
+                <w:szCs w:val="19"/>
+              </w:rPr>
+              <w:t xml:space="preserve">62,751</w:t>
+            </w:r>
+          </w:p>
+        </w:tc>
+        <w:tc>
+          <w:tcPr>
+            <w:tcW w:type="dxa" w:w="1030"/>
+            <w:shd w:fill="FFFFFF" w:val="clear"/>
+            <w:tcMar>
+              <w:top w:type="dxa" w:w="60"/>
+              <w:left w:type="dxa" w:w="90"/>
+              <w:bottom w:type="dxa" w:w="60"/>
+              <w:right w:type="dxa" w:w="90"/>
+            </w:tcMar>
+          </w:tcPr>
+          <w:p>
+            <w:pPr>
+              <w:spacing w:after="0"/>
+              <w:jc w:val="center"/>
+            </w:pPr>
+            <w:r>
+              <w:rPr>
+                <w:b w:val="false"/>
+                <w:bCs w:val="false"/>
+                <w:sz w:val="19"/>
+                <w:szCs w:val="19"/>
+              </w:rPr>
+              <w:t xml:space="preserve">52,366</w:t>
+            </w:r>
+          </w:p>
+        </w:tc>
+        <w:tc>
+          <w:tcPr>
+            <w:tcW w:type="dxa" w:w="936"/>
+            <w:shd w:fill="FFFFFF" w:val="clear"/>
+            <w:tcMar>
+              <w:top w:type="dxa" w:w="60"/>
+              <w:left w:type="dxa" w:w="90"/>
+              <w:bottom w:type="dxa" w:w="60"/>
+              <w:right w:type="dxa" w:w="90"/>
+            </w:tcMar>
+          </w:tcPr>
+          <w:p>
+            <w:pPr>
+              <w:spacing w:after="0"/>
+              <w:jc w:val="center"/>
+            </w:pPr>
+            <w:r>
+              <w:rPr>
+                <w:b w:val="false"/>
+                <w:bCs w:val="false"/>
+                <w:sz w:val="19"/>
+                <w:szCs w:val="19"/>
+              </w:rPr>
+              <w:t xml:space="preserve">16,302</w:t>
+            </w:r>
+          </w:p>
+        </w:tc>
+        <w:tc>
+          <w:tcPr>
+            <w:tcW w:type="dxa" w:w="1123"/>
+            <w:shd w:fill="FFFFFF" w:val="clear"/>
+            <w:tcMar>
+              <w:top w:type="dxa" w:w="60"/>
+              <w:left w:type="dxa" w:w="90"/>
+              <w:bottom w:type="dxa" w:w="60"/>
+              <w:right w:type="dxa" w:w="90"/>
+            </w:tcMar>
+          </w:tcPr>
+          <w:p>
+            <w:pPr>
+              <w:spacing w:after="0"/>
+              <w:jc w:val="center"/>
+            </w:pPr>
+            <w:r>
+              <w:rPr>
+                <w:b w:val="false"/>
+                <w:bCs w:val="false"/>
+                <w:sz w:val="19"/>
+                <w:szCs w:val="19"/>
+              </w:rPr>
+              <w:t xml:space="preserve">54.51%</w:t>
+            </w:r>
+          </w:p>
+        </w:tc>
+        <w:tc>
+          <w:tcPr>
+            <w:tcW w:type="dxa" w:w="1030"/>
+            <w:shd w:fill="FFFFFF" w:val="clear"/>
+            <w:tcMar>
+              <w:top w:type="dxa" w:w="60"/>
+              <w:left w:type="dxa" w:w="90"/>
+              <w:bottom w:type="dxa" w:w="60"/>
+              <w:right w:type="dxa" w:w="90"/>
+            </w:tcMar>
+          </w:tcPr>
+          <w:p>
+            <w:pPr>
+              <w:spacing w:after="0"/>
+              <w:jc w:val="center"/>
+            </w:pPr>
+            <w:r>
+              <w:rPr>
+                <w:b w:val="false"/>
+                <w:bCs w:val="false"/>
+                <w:sz w:val="19"/>
+                <w:szCs w:val="19"/>
+              </w:rPr>
+              <w:t xml:space="preserve">79.38%</w:t>
+            </w:r>
+          </w:p>
+        </w:tc>
+        <w:tc>
+          <w:tcPr>
+            <w:tcW w:type="dxa" w:w="1030"/>
+            <w:shd w:fill="FFFFFF" w:val="clear"/>
+            <w:tcMar>
+              <w:top w:type="dxa" w:w="60"/>
+              <w:left w:type="dxa" w:w="90"/>
+              <w:bottom w:type="dxa" w:w="60"/>
+              <w:right w:type="dxa" w:w="90"/>
+            </w:tcMar>
+          </w:tcPr>
+          <w:p>
+            <w:pPr>
+              <w:spacing w:after="0"/>
+              <w:jc w:val="center"/>
+            </w:pPr>
+            <w:r>
+              <w:rPr>
+                <w:b w:val="false"/>
+                <w:bCs w:val="false"/>
+                <w:sz w:val="19"/>
+                <w:szCs w:val="19"/>
+              </w:rPr>
+              <w:t xml:space="preserve">64.64%</w:t>
+            </w:r>
+          </w:p>
+        </w:tc>
+        <w:tc>
+          <w:tcPr>
+            <w:tcW w:type="dxa" w:w="935"/>
+            <w:shd w:fill="FFFFFF" w:val="clear"/>
+            <w:tcMar>
+              <w:top w:type="dxa" w:w="60"/>
+              <w:left w:type="dxa" w:w="90"/>
+              <w:bottom w:type="dxa" w:w="60"/>
+              <w:right w:type="dxa" w:w="90"/>
+            </w:tcMar>
+          </w:tcPr>
+          <w:p>
+            <w:pPr>
+              <w:spacing w:after="0"/>
+              <w:jc w:val="center"/>
+            </w:pPr>
+            <w:r>
+              <w:rPr>
+                <w:b w:val="false"/>
+                <w:bCs w:val="false"/>
+                <w:sz w:val="19"/>
+                <w:szCs w:val="19"/>
+              </w:rPr>
+              <w:t xml:space="preserve">899</w:t>
+            </w:r>
+          </w:p>
+        </w:tc>
+      </w:tr>
+    </w:tbl>
+    <w:p>
+      <w:pPr>
+        <w:pStyle w:val="Heading2"/>
+        <w:spacing w:after="140" w:before="280"/>
+      </w:pPr>
+      <w:r>
+        <w:rPr>
+          <w:b/>
+          <w:bCs/>
+          <w:color w:val="2E5C8A"/>
+          <w:sz w:val="24"/>
+          <w:szCs w:val="24"/>
+        </w:rPr>
+        <w:t xml:space="preserve">8.2 Tracking over the full clip</w:t>
       </w:r>
     </w:p>
     <w:tbl>
@@ -6282,7 +7204,7 @@
                 <w:sz w:val="19"/>
                 <w:szCs w:val="19"/>
               </w:rPr>
-              <w:t xml:space="preserve">Tracks (601f)</w:t>
+              <w:t xml:space="preserve">Tracks (899f)</w:t>
             </w:r>
           </w:p>
         </w:tc>
@@ -6310,7 +7232,7 @@
                 <w:sz w:val="19"/>
                 <w:szCs w:val="19"/>
               </w:rPr>
-              <w:t xml:space="preserve">Avg. length (601f)</w:t>
+              <w:t xml:space="preserve">Avg. length (899f)</w:t>
             </w:r>
           </w:p>
         </w:tc>
@@ -6420,7 +7342,7 @@
                 <w:sz w:val="19"/>
                 <w:szCs w:val="19"/>
               </w:rPr>
-              <w:t xml:space="preserve">298</w:t>
+              <w:t xml:space="preserve">401</w:t>
             </w:r>
           </w:p>
         </w:tc>
@@ -6447,7 +7369,7 @@
                 <w:sz w:val="19"/>
                 <w:szCs w:val="19"/>
               </w:rPr>
-              <w:t xml:space="preserve">168.3</w:t>
+              <w:t xml:space="preserve">190.88</w:t>
             </w:r>
           </w:p>
         </w:tc>
@@ -6557,7 +7479,7 @@
                 <w:sz w:val="19"/>
                 <w:szCs w:val="19"/>
               </w:rPr>
-              <w:t xml:space="preserve">215</w:t>
+              <w:t xml:space="preserve">262</w:t>
             </w:r>
           </w:p>
         </w:tc>
@@ -6584,7 +7506,7 @@
                 <w:sz w:val="19"/>
                 <w:szCs w:val="19"/>
               </w:rPr>
-              <w:t xml:space="preserve">293.16</w:t>
+              <w:t xml:space="preserve">368.96</w:t>
             </w:r>
           </w:p>
         </w:tc>
@@ -6599,7 +7521,21 @@
           <w:sz w:val="21"/>
           <w:szCs w:val="21"/>
         </w:rPr>
-        <w:t xml:space="preserve">The gap between the two trackers widens sharply with more footage. On 101 frames JPDAF's tracks were 12 percent longer than SORT's; on 601 frames they are 74 percent longer, and JPDAF consolidates the same cells into 28 percent fewer tracks. This is exactly the fragmentation problem the 2017 paper set out to solve, and it is only visible once the clip is long enough for tracks to break.</w:t>
+        <w:t xml:space="preserve">This is the sharpened conclusion. On 101 frames JPDAF's tracks were 12 percent longer than SORT's, a difference small enough to look like noise. On the full clip they are 93 percent longer, and JPDAF consolidates the same swimming cells into 35 percent fewer tracks. Both trackers see identical input, so this is purely the association algorithm: SORT loses a cell and restarts it as a new track, JPDAF holds on. That is precisely the fragmentation problem the 2017 paper set out to solve, and it is invisible on a short clip because tracks have not had time to break yet.</w:t>
+      </w:r>
+    </w:p>
+    <w:p>
+      <w:pPr>
+        <w:spacing w:after="120" w:before="50"/>
+      </w:pPr>
+      <w:r>
+        <w:rPr>
+          <w:b/>
+          <w:bCs/>
+          <w:sz w:val="21"/>
+          <w:szCs w:val="21"/>
+        </w:rPr>
+        <w:t xml:space="preserve">Any comparison of trackers on a three-second window will therefore understate the difference between them.</w:t>
       </w:r>
     </w:p>
     <w:p>
@@ -6615,7 +7551,7 @@
           <w:sz w:val="24"/>
           <w:szCs w:val="24"/>
         </w:rPr>
-        <w:t xml:space="preserve">8.2 CASA parameters over a longer window</w:t>
+        <w:t xml:space="preserve">8.3 CASA parameters over the full clip</w:t>
       </w:r>
     </w:p>
     <w:tbl>
@@ -7055,7 +7991,7 @@
                 <w:sz w:val="19"/>
                 <w:szCs w:val="19"/>
               </w:rPr>
-              <w:t xml:space="preserve">pycasa: GT + SORT (601f)</w:t>
+              <w:t xml:space="preserve">pycasa: GT + SORT (899f)</w:t>
             </w:r>
           </w:p>
         </w:tc>
@@ -7082,7 +8018,7 @@
                 <w:sz w:val="19"/>
                 <w:szCs w:val="19"/>
               </w:rPr>
-              <w:t xml:space="preserve">56.41</w:t>
+              <w:t xml:space="preserve">56.43</w:t>
             </w:r>
           </w:p>
         </w:tc>
@@ -7109,7 +8045,7 @@
                 <w:sz w:val="19"/>
                 <w:szCs w:val="19"/>
               </w:rPr>
-              <w:t xml:space="preserve">23.08</w:t>
+              <w:t xml:space="preserve">23.82</w:t>
             </w:r>
           </w:p>
         </w:tc>
@@ -7136,7 +8072,7 @@
                 <w:sz w:val="19"/>
                 <w:szCs w:val="19"/>
               </w:rPr>
-              <w:t xml:space="preserve">1.28</w:t>
+              <w:t xml:space="preserve">1.25</w:t>
             </w:r>
           </w:p>
         </w:tc>
@@ -7163,7 +8099,7 @@
                 <w:sz w:val="19"/>
                 <w:szCs w:val="19"/>
               </w:rPr>
-              <w:t xml:space="preserve">19.23</w:t>
+              <w:t xml:space="preserve">18.5</w:t>
             </w:r>
           </w:p>
         </w:tc>
@@ -7190,7 +8126,7 @@
                 <w:sz w:val="19"/>
                 <w:szCs w:val="19"/>
               </w:rPr>
-              <w:t xml:space="preserve">53.4</w:t>
+              <w:t xml:space="preserve">54.48</w:t>
             </w:r>
           </w:p>
         </w:tc>
@@ -7217,7 +8153,198 @@
                 <w:sz w:val="19"/>
                 <w:szCs w:val="19"/>
               </w:rPr>
-              <w:t xml:space="preserve">117.47</w:t>
+              <w:t xml:space="preserve">119.86</w:t>
+            </w:r>
+          </w:p>
+        </w:tc>
+      </w:tr>
+      <w:tr>
+        <w:tc>
+          <w:tcPr>
+            <w:tcW w:type="dxa" w:w="2434"/>
+            <w:shd w:fill="FFFFFF" w:val="clear"/>
+            <w:tcMar>
+              <w:top w:type="dxa" w:w="60"/>
+              <w:left w:type="dxa" w:w="90"/>
+              <w:bottom w:type="dxa" w:w="60"/>
+              <w:right w:type="dxa" w:w="90"/>
+            </w:tcMar>
+          </w:tcPr>
+          <w:p>
+            <w:pPr>
+              <w:spacing w:after="0"/>
+              <w:jc w:val="left"/>
+            </w:pPr>
+            <w:r>
+              <w:rPr>
+                <w:b/>
+                <w:bCs/>
+                <w:sz w:val="19"/>
+                <w:szCs w:val="19"/>
+              </w:rPr>
+              <w:t xml:space="preserve">pycasa: YOLO26 + SORT (251f)</w:t>
+            </w:r>
+          </w:p>
+        </w:tc>
+        <w:tc>
+          <w:tcPr>
+            <w:tcW w:type="dxa" w:w="1123"/>
+            <w:shd w:fill="FFFFFF" w:val="clear"/>
+            <w:tcMar>
+              <w:top w:type="dxa" w:w="60"/>
+              <w:left w:type="dxa" w:w="90"/>
+              <w:bottom w:type="dxa" w:w="60"/>
+              <w:right w:type="dxa" w:w="90"/>
+            </w:tcMar>
+          </w:tcPr>
+          <w:p>
+            <w:pPr>
+              <w:spacing w:after="0"/>
+              <w:jc w:val="center"/>
+            </w:pPr>
+            <w:r>
+              <w:rPr>
+                <w:b w:val="false"/>
+                <w:bCs w:val="false"/>
+                <w:sz w:val="19"/>
+                <w:szCs w:val="19"/>
+              </w:rPr>
+              <w:t xml:space="preserve">37.9</w:t>
+            </w:r>
+          </w:p>
+        </w:tc>
+        <w:tc>
+          <w:tcPr>
+            <w:tcW w:type="dxa" w:w="1123"/>
+            <w:shd w:fill="FFFFFF" w:val="clear"/>
+            <w:tcMar>
+              <w:top w:type="dxa" w:w="60"/>
+              <w:left w:type="dxa" w:w="90"/>
+              <w:bottom w:type="dxa" w:w="60"/>
+              <w:right w:type="dxa" w:w="90"/>
+            </w:tcMar>
+          </w:tcPr>
+          <w:p>
+            <w:pPr>
+              <w:spacing w:after="0"/>
+              <w:jc w:val="center"/>
+            </w:pPr>
+            <w:r>
+              <w:rPr>
+                <w:b w:val="false"/>
+                <w:bCs w:val="false"/>
+                <w:sz w:val="19"/>
+                <w:szCs w:val="19"/>
+              </w:rPr>
+              <w:t xml:space="preserve">22.37</w:t>
+            </w:r>
+          </w:p>
+        </w:tc>
+        <w:tc>
+          <w:tcPr>
+            <w:tcW w:type="dxa" w:w="1310"/>
+            <w:shd w:fill="FFFFFF" w:val="clear"/>
+            <w:tcMar>
+              <w:top w:type="dxa" w:w="60"/>
+              <w:left w:type="dxa" w:w="90"/>
+              <w:bottom w:type="dxa" w:w="60"/>
+              <w:right w:type="dxa" w:w="90"/>
+            </w:tcMar>
+          </w:tcPr>
+          <w:p>
+            <w:pPr>
+              <w:spacing w:after="0"/>
+              <w:jc w:val="center"/>
+            </w:pPr>
+            <w:r>
+              <w:rPr>
+                <w:b w:val="false"/>
+                <w:bCs w:val="false"/>
+                <w:sz w:val="19"/>
+                <w:szCs w:val="19"/>
+              </w:rPr>
+              <w:t xml:space="preserve">1.37</w:t>
+            </w:r>
+          </w:p>
+        </w:tc>
+        <w:tc>
+          <w:tcPr>
+            <w:tcW w:type="dxa" w:w="1310"/>
+            <w:shd w:fill="FFFFFF" w:val="clear"/>
+            <w:tcMar>
+              <w:top w:type="dxa" w:w="60"/>
+              <w:left w:type="dxa" w:w="90"/>
+              <w:bottom w:type="dxa" w:w="60"/>
+              <w:right w:type="dxa" w:w="90"/>
+            </w:tcMar>
+          </w:tcPr>
+          <w:p>
+            <w:pPr>
+              <w:spacing w:after="0"/>
+              <w:jc w:val="center"/>
+            </w:pPr>
+            <w:r>
+              <w:rPr>
+                <w:b w:val="false"/>
+                <w:bCs w:val="false"/>
+                <w:sz w:val="19"/>
+                <w:szCs w:val="19"/>
+              </w:rPr>
+              <w:t xml:space="preserve">38.36</w:t>
+            </w:r>
+          </w:p>
+        </w:tc>
+        <w:tc>
+          <w:tcPr>
+            <w:tcW w:type="dxa" w:w="1123"/>
+            <w:shd w:fill="FFFFFF" w:val="clear"/>
+            <w:tcMar>
+              <w:top w:type="dxa" w:w="60"/>
+              <w:left w:type="dxa" w:w="90"/>
+              <w:bottom w:type="dxa" w:w="60"/>
+              <w:right w:type="dxa" w:w="90"/>
+            </w:tcMar>
+          </w:tcPr>
+          <w:p>
+            <w:pPr>
+              <w:spacing w:after="0"/>
+              <w:jc w:val="center"/>
+            </w:pPr>
+            <w:r>
+              <w:rPr>
+                <w:b w:val="false"/>
+                <w:bCs w:val="false"/>
+                <w:sz w:val="19"/>
+                <w:szCs w:val="19"/>
+              </w:rPr>
+              <w:t xml:space="preserve">79.82</w:t>
+            </w:r>
+          </w:p>
+        </w:tc>
+        <w:tc>
+          <w:tcPr>
+            <w:tcW w:type="dxa" w:w="937"/>
+            <w:shd w:fill="FFFFFF" w:val="clear"/>
+            <w:tcMar>
+              <w:top w:type="dxa" w:w="60"/>
+              <w:left w:type="dxa" w:w="90"/>
+              <w:bottom w:type="dxa" w:w="60"/>
+              <w:right w:type="dxa" w:w="90"/>
+            </w:tcMar>
+          </w:tcPr>
+          <w:p>
+            <w:pPr>
+              <w:spacing w:after="0"/>
+              <w:jc w:val="center"/>
+            </w:pPr>
+            <w:r>
+              <w:rPr>
+                <w:b w:val="false"/>
+                <w:bCs w:val="false"/>
+                <w:sz w:val="19"/>
+                <w:szCs w:val="19"/>
+              </w:rPr>
+              <w:t xml:space="preserve">175.6</w:t>
             </w:r>
           </w:p>
         </w:tc>
@@ -7232,7 +8359,7 @@
           <w:sz w:val="21"/>
           <w:szCs w:val="21"/>
         </w:rPr>
-        <w:t xml:space="preserve">For ground truth with SORT the concentration error did not improve with more footage: 59.52 M/mL on 101 frames and 53.4 M/mL on 601 frames, against the machine's 69 M/mL, a 14 percent and 23 percent gap respectively. The motility grades did move: rapid rose from 49.55 to 56.41 percent and immotile fell from 20.72 to 19.23 percent, both moving away from the reference rather than towards it. Longer tracks let more cells accumulate enough displacement to be graded rapid, which suggests the 101-frame agreement on grades was partly coincidental.</w:t>
+        <w:t xml:space="preserve">For ground truth with SORT the concentration error did not improve with more footage: 59.52 M/mL on 101 frames and 54.48 M/mL on 899 frames, against the machine's 69 M/mL, a 14 percent and 21 percent gap respectively. The motility grades did move: rapid rose from 49.55 to 56.43 percent and immotile fell from 20.72 to 18.5 percent, both moving away from the reference rather than towards it. Longer tracks let more cells accumulate enough displacement to be graded rapid, which suggests the 101-frame agreement on grades was partly coincidental.</w:t>
       </w:r>
     </w:p>
     <w:p>
@@ -7688,7 +8815,7 @@
                 <w:sz w:val="19"/>
                 <w:szCs w:val="19"/>
               </w:rPr>
-              <w:t xml:space="preserve">16</w:t>
+              <w:t xml:space="preserve">19</w:t>
             </w:r>
           </w:p>
         </w:tc>
@@ -7715,7 +8842,7 @@
                 <w:sz w:val="19"/>
                 <w:szCs w:val="19"/>
               </w:rPr>
-              <w:t xml:space="preserve">16</w:t>
+              <w:t xml:space="preserve">19</w:t>
             </w:r>
           </w:p>
         </w:tc>
@@ -7798,7 +8925,7 @@
                 <w:sz w:val="19"/>
                 <w:szCs w:val="19"/>
               </w:rPr>
-              <w:t xml:space="preserve">4</w:t>
+              <w:t xml:space="preserve">8</w:t>
             </w:r>
           </w:p>
         </w:tc>
@@ -7825,7 +8952,7 @@
                 <w:sz w:val="19"/>
                 <w:szCs w:val="19"/>
               </w:rPr>
-              <w:t xml:space="preserve">2</w:t>
+              <w:t xml:space="preserve">8</w:t>
             </w:r>
           </w:p>
         </w:tc>
@@ -7908,7 +9035,7 @@
                 <w:sz w:val="19"/>
                 <w:szCs w:val="19"/>
               </w:rPr>
-              <w:t xml:space="preserve">7</w:t>
+              <w:t xml:space="preserve">14</w:t>
             </w:r>
           </w:p>
         </w:tc>
@@ -7935,7 +9062,7 @@
                 <w:sz w:val="19"/>
                 <w:szCs w:val="19"/>
               </w:rPr>
-              <w:t xml:space="preserve">6</w:t>
+              <w:t xml:space="preserve">13</w:t>
             </w:r>
           </w:p>
         </w:tc>
@@ -8018,7 +9145,7 @@
                 <w:sz w:val="19"/>
                 <w:szCs w:val="19"/>
               </w:rPr>
-              <w:t xml:space="preserve">2</w:t>
+              <w:t xml:space="preserve">3</w:t>
             </w:r>
           </w:p>
         </w:tc>
@@ -8045,7 +9172,7 @@
                 <w:sz w:val="19"/>
                 <w:szCs w:val="19"/>
               </w:rPr>
-              <w:t xml:space="preserve">1</w:t>
+              <w:t xml:space="preserve">3</w:t>
             </w:r>
           </w:p>
         </w:tc>
@@ -8128,7 +9255,7 @@
                 <w:sz w:val="19"/>
                 <w:szCs w:val="19"/>
               </w:rPr>
-              <w:t xml:space="preserve">11</w:t>
+              <w:t xml:space="preserve">19</w:t>
             </w:r>
           </w:p>
         </w:tc>
@@ -8155,7 +9282,7 @@
                 <w:sz w:val="19"/>
                 <w:szCs w:val="19"/>
               </w:rPr>
-              <w:t xml:space="preserve">9</w:t>
+              <w:t xml:space="preserve">18</w:t>
             </w:r>
           </w:p>
         </w:tc>
@@ -8238,7 +9365,7 @@
                 <w:sz w:val="19"/>
                 <w:szCs w:val="19"/>
               </w:rPr>
-              <w:t xml:space="preserve">15</w:t>
+              <w:t xml:space="preserve">18</w:t>
             </w:r>
           </w:p>
         </w:tc>
@@ -8265,7 +9392,7 @@
                 <w:sz w:val="19"/>
                 <w:szCs w:val="19"/>
               </w:rPr>
-              <w:t xml:space="preserve">13</w:t>
+              <w:t xml:space="preserve">15</w:t>
             </w:r>
           </w:p>
         </w:tc>
@@ -8297,6 +9424,116 @@
           </w:p>
         </w:tc>
       </w:tr>
+      <w:tr>
+        <w:tc>
+          <w:tcPr>
+            <w:tcW w:type="dxa" w:w="1872"/>
+            <w:shd w:fill="FFFFFF" w:val="clear"/>
+            <w:tcMar>
+              <w:top w:type="dxa" w:w="60"/>
+              <w:left w:type="dxa" w:w="90"/>
+              <w:bottom w:type="dxa" w:w="60"/>
+              <w:right w:type="dxa" w:w="90"/>
+            </w:tcMar>
+          </w:tcPr>
+          <w:p>
+            <w:pPr>
+              <w:spacing w:after="0"/>
+              <w:jc w:val="left"/>
+            </w:pPr>
+            <w:r>
+              <w:rPr>
+                <w:b/>
+                <w:bCs/>
+                <w:sz w:val="19"/>
+                <w:szCs w:val="19"/>
+              </w:rPr>
+              <w:t xml:space="preserve">visualization</w:t>
+            </w:r>
+          </w:p>
+        </w:tc>
+        <w:tc>
+          <w:tcPr>
+            <w:tcW w:type="dxa" w:w="842"/>
+            <w:shd w:fill="FFFFFF" w:val="clear"/>
+            <w:tcMar>
+              <w:top w:type="dxa" w:w="60"/>
+              <w:left w:type="dxa" w:w="90"/>
+              <w:bottom w:type="dxa" w:w="60"/>
+              <w:right w:type="dxa" w:w="90"/>
+            </w:tcMar>
+          </w:tcPr>
+          <w:p>
+            <w:pPr>
+              <w:spacing w:after="0"/>
+              <w:jc w:val="center"/>
+            </w:pPr>
+            <w:r>
+              <w:rPr>
+                <w:b w:val="false"/>
+                <w:bCs w:val="false"/>
+                <w:sz w:val="19"/>
+                <w:szCs w:val="19"/>
+              </w:rPr>
+              <w:t xml:space="preserve">22</w:t>
+            </w:r>
+          </w:p>
+        </w:tc>
+        <w:tc>
+          <w:tcPr>
+            <w:tcW w:type="dxa" w:w="842"/>
+            <w:shd w:fill="FFFFFF" w:val="clear"/>
+            <w:tcMar>
+              <w:top w:type="dxa" w:w="60"/>
+              <w:left w:type="dxa" w:w="90"/>
+              <w:bottom w:type="dxa" w:w="60"/>
+              <w:right w:type="dxa" w:w="90"/>
+            </w:tcMar>
+          </w:tcPr>
+          <w:p>
+            <w:pPr>
+              <w:spacing w:after="0"/>
+              <w:jc w:val="center"/>
+            </w:pPr>
+            <w:r>
+              <w:rPr>
+                <w:b w:val="false"/>
+                <w:bCs w:val="false"/>
+                <w:sz w:val="19"/>
+                <w:szCs w:val="19"/>
+              </w:rPr>
+              <w:t xml:space="preserve">22</w:t>
+            </w:r>
+          </w:p>
+        </w:tc>
+        <w:tc>
+          <w:tcPr>
+            <w:tcW w:type="dxa" w:w="5804"/>
+            <w:shd w:fill="FFFFFF" w:val="clear"/>
+            <w:tcMar>
+              <w:top w:type="dxa" w:w="60"/>
+              <w:left w:type="dxa" w:w="90"/>
+              <w:bottom w:type="dxa" w:w="60"/>
+              <w:right w:type="dxa" w:w="90"/>
+            </w:tcMar>
+          </w:tcPr>
+          <w:p>
+            <w:pPr>
+              <w:spacing w:after="0"/>
+              <w:jc w:val="center"/>
+            </w:pPr>
+            <w:r>
+              <w:rPr>
+                <w:b w:val="false"/>
+                <w:bCs w:val="false"/>
+                <w:sz w:val="19"/>
+                <w:szCs w:val="19"/>
+              </w:rPr>
+              <w:t xml:space="preserve">plot_frame, timelapse, radar, density scatter, interactive calculator</w:t>
+            </w:r>
+          </w:p>
+        </w:tc>
+      </w:tr>
     </w:tbl>
     <w:p>
       <w:pPr>
@@ -8307,7 +9544,7 @@
           <w:sz w:val="21"/>
           <w:szCs w:val="21"/>
         </w:rPr>
-        <w:t xml:space="preserve">A pass on a deliberately invalid input means the function raised the appropriate error. 83 of 92 cases passed; the 9 failures are the defects in section 10, not test artefacts.</w:t>
+        <w:t xml:space="preserve">A pass on a deliberately invalid input means the function raised the appropriate error. 134 of 140 cases passed; the 6 failures are the defects in section 10, not test artefacts.</w:t>
       </w:r>
     </w:p>
     <w:p>
@@ -8476,7 +9713,7 @@
           <w:sz w:val="21"/>
           <w:szCs w:val="21"/>
         </w:rPr>
-        <w:t xml:space="preserve">Six issues were identified and reproduced. They are ordered by how much they affect results.</w:t>
+        <w:t xml:space="preserve">Six issues were identified and reproduced. They are ordered by how much they affect the reported results. The first three change numbers; the last three cost time.</w:t>
       </w:r>
     </w:p>
     <w:tbl>
@@ -9242,7 +10479,7 @@
                 <w:sz w:val="19"/>
                 <w:szCs w:val="19"/>
               </w:rPr>
-              <w:t xml:space="preserve">The full 899-frame clip needs a single 3.3 GB allocation, which caps the usable clip length</w:t>
+              <w:t xml:space="preserve">The full clip needs a single 3.3 GB allocation, so clip length is bounded by the largest free block rather than by total memory</w:t>
             </w:r>
           </w:p>
         </w:tc>
@@ -9269,7 +10506,7 @@
                 <w:sz w:val="19"/>
                 <w:szCs w:val="19"/>
               </w:rPr>
-              <w:t xml:space="preserve">Load a shorter window, or free memory first</w:t>
+              <w:t xml:space="preserve">Close other work, or load a shorter window</w:t>
             </w:r>
           </w:p>
         </w:tc>

</xml_diff>

<commit_message>
Drop the local path-encoding note from the report
Co-Authored-By: Claude Opus 5 <noreply@anthropic.com>
</commit_message>
<xml_diff>
--- a/pycasa_Testing_Report.docx
+++ b/pycasa_Testing_Report.docx
@@ -127,6 +127,7 @@
     <w:p>
       <w:pPr>
         <w:pStyle w:val="Heading1"/>
+        <w:keepNext/>
         <w:spacing w:after="140" w:before="280"/>
       </w:pPr>
       <w:r>
@@ -167,6 +168,7 @@
     <w:p>
       <w:pPr>
         <w:pStyle w:val="Heading1"/>
+        <w:keepNext/>
         <w:spacing w:after="140" w:before="280"/>
       </w:pPr>
       <w:r>
@@ -388,6 +390,7 @@
     <w:p>
       <w:pPr>
         <w:pStyle w:val="Heading1"/>
+        <w:keepNext/>
         <w:spacing w:after="140" w:before="280"/>
       </w:pPr>
       <w:r>
@@ -492,7 +495,7 @@
           <w:sz w:val="21"/>
           <w:szCs w:val="21"/>
         </w:rPr>
-        <w:t xml:space="preserve">Four setup obstacles were encountered and resolved. They are reported here because each one would stop a new user.</w:t>
+        <w:t xml:space="preserve">Three setup obstacles were encountered and resolved. They are reported here because each one would stop a new user.</w:t>
       </w:r>
     </w:p>
     <w:tbl>
@@ -850,98 +853,11 @@
           </w:p>
         </w:tc>
       </w:tr>
-      <w:tr>
-        <w:tc>
-          <w:tcPr>
-            <w:tcW w:type="dxa" w:w="2808"/>
-            <w:shd w:fill="F5F8FB" w:val="clear"/>
-            <w:tcMar>
-              <w:top w:type="dxa" w:w="60"/>
-              <w:left w:type="dxa" w:w="90"/>
-              <w:bottom w:type="dxa" w:w="60"/>
-              <w:right w:type="dxa" w:w="90"/>
-            </w:tcMar>
-          </w:tcPr>
-          <w:p>
-            <w:pPr>
-              <w:spacing w:after="0"/>
-              <w:jc w:val="left"/>
-            </w:pPr>
-            <w:r>
-              <w:rPr>
-                <w:b/>
-                <w:bCs/>
-                <w:sz w:val="19"/>
-                <w:szCs w:val="19"/>
-              </w:rPr>
-              <w:t xml:space="preserve">YOLOv5 weights fail to load on some paths</w:t>
-            </w:r>
-          </w:p>
-        </w:tc>
-        <w:tc>
-          <w:tcPr>
-            <w:tcW w:type="dxa" w:w="3557"/>
-            <w:shd w:fill="F5F8FB" w:val="clear"/>
-            <w:tcMar>
-              <w:top w:type="dxa" w:w="60"/>
-              <w:left w:type="dxa" w:w="90"/>
-              <w:bottom w:type="dxa" w:w="60"/>
-              <w:right w:type="dxa" w:w="90"/>
-            </w:tcMar>
-          </w:tcPr>
-          <w:p>
-            <w:pPr>
-              <w:spacing w:after="0"/>
-              <w:jc w:val="center"/>
-            </w:pPr>
-            <w:r>
-              <w:rPr>
-                <w:b w:val="false"/>
-                <w:bCs w:val="false"/>
-                <w:sz w:val="19"/>
-                <w:szCs w:val="19"/>
-              </w:rPr>
-              <w:t xml:space="preserve">The TorchScript loader cannot open paths containing non-ASCII characters, which affects any non-English locale</w:t>
-            </w:r>
-          </w:p>
-        </w:tc>
-        <w:tc>
-          <w:tcPr>
-            <w:tcW w:type="dxa" w:w="2995"/>
-            <w:shd w:fill="F5F8FB" w:val="clear"/>
-            <w:tcMar>
-              <w:top w:type="dxa" w:w="60"/>
-              <w:left w:type="dxa" w:w="90"/>
-              <w:bottom w:type="dxa" w:w="60"/>
-              <w:right w:type="dxa" w:w="90"/>
-            </w:tcMar>
-          </w:tcPr>
-          <w:p>
-            <w:pPr>
-              <w:spacing w:after="0"/>
-              <w:jc w:val="center"/>
-            </w:pPr>
-            <w:r>
-              <w:rPr>
-                <w:b w:val="false"/>
-                <w:bCs w:val="false"/>
-                <w:sz w:val="19"/>
-                <w:szCs w:val="19"/>
-              </w:rPr>
-              <w:t xml:space="preserve">Point PYCASA_PROJECT_ROOT at an ASCII-only directory</w:t>
-            </w:r>
-          </w:p>
-        </w:tc>
-      </w:tr>
     </w:tbl>
     <w:p>
-      <w:r>
-        <w:br w:type="page"/>
-      </w:r>
-    </w:p>
-    <w:p>
       <w:pPr>
         <w:pStyle w:val="Heading1"/>
+        <w:keepNext/>
         <w:spacing w:after="140" w:before="280"/>
       </w:pPr>
       <w:r>
@@ -998,6 +914,7 @@
     <w:p>
       <w:pPr>
         <w:pStyle w:val="Heading2"/>
+        <w:keepNext/>
         <w:spacing w:after="140" w:before="280"/>
       </w:pPr>
       <w:r>
@@ -1809,6 +1726,7 @@
     <w:p>
       <w:pPr>
         <w:pStyle w:val="Heading2"/>
+        <w:keepNext/>
         <w:spacing w:after="140" w:before="280"/>
       </w:pPr>
       <w:r>
@@ -1925,13 +1843,9 @@
       </w:r>
     </w:p>
     <w:p>
-      <w:r>
-        <w:br w:type="page"/>
-      </w:r>
-    </w:p>
-    <w:p>
       <w:pPr>
         <w:pStyle w:val="Heading1"/>
+        <w:keepNext/>
         <w:spacing w:after="140" w:before="280"/>
       </w:pPr>
       <w:r>
@@ -3288,13 +3202,9 @@
       </w:r>
     </w:p>
     <w:p>
-      <w:r>
-        <w:br w:type="page"/>
-      </w:r>
-    </w:p>
-    <w:p>
       <w:pPr>
         <w:pStyle w:val="Heading1"/>
+        <w:keepNext/>
         <w:spacing w:after="140" w:before="280"/>
       </w:pPr>
       <w:r>
@@ -3443,13 +3353,9 @@
       </w:r>
     </w:p>
     <w:p>
-      <w:r>
-        <w:br w:type="page"/>
-      </w:r>
-    </w:p>
-    <w:p>
       <w:pPr>
         <w:pStyle w:val="Heading1"/>
+        <w:keepNext/>
         <w:spacing w:after="140" w:before="280"/>
       </w:pPr>
       <w:r>
@@ -4010,13 +3916,9 @@
       </w:r>
     </w:p>
     <w:p>
-      <w:r>
-        <w:br w:type="page"/>
-      </w:r>
-    </w:p>
-    <w:p>
       <w:pPr>
         <w:pStyle w:val="Heading1"/>
+        <w:keepNext/>
         <w:spacing w:after="140" w:before="280"/>
       </w:pPr>
       <w:r>
@@ -4087,6 +3989,7 @@
     <w:p>
       <w:pPr>
         <w:pStyle w:val="Heading2"/>
+        <w:keepNext/>
         <w:spacing w:after="140" w:before="280"/>
       </w:pPr>
       <w:r>
@@ -4983,6 +4886,7 @@
     <w:p>
       <w:pPr>
         <w:pStyle w:val="Heading2"/>
+        <w:keepNext/>
         <w:spacing w:after="140" w:before="280"/>
       </w:pPr>
       <w:r>
@@ -6077,13 +5981,9 @@
       </w:r>
     </w:p>
     <w:p>
-      <w:r>
-        <w:br w:type="page"/>
-      </w:r>
-    </w:p>
-    <w:p>
       <w:pPr>
         <w:pStyle w:val="Heading1"/>
+        <w:keepNext/>
         <w:spacing w:after="140" w:before="280"/>
       </w:pPr>
       <w:r>
@@ -6126,6 +6026,7 @@
     <w:p>
       <w:pPr>
         <w:pStyle w:val="Heading2"/>
+        <w:keepNext/>
         <w:spacing w:after="140" w:before="280"/>
       </w:pPr>
       <w:r>
@@ -6671,7 +6572,7 @@
                 <w:sz w:val="19"/>
                 <w:szCs w:val="19"/>
               </w:rPr>
-              <w:t xml:space="preserve">23,636</w:t>
+              <w:t xml:space="preserve">80,271</w:t>
             </w:r>
           </w:p>
         </w:tc>
@@ -6698,7 +6599,7 @@
                 <w:sz w:val="19"/>
                 <w:szCs w:val="19"/>
               </w:rPr>
-              <w:t xml:space="preserve">13,550</w:t>
+              <w:t xml:space="preserve">42,369</w:t>
             </w:r>
           </w:p>
         </w:tc>
@@ -6725,7 +6626,7 @@
                 <w:sz w:val="19"/>
                 <w:szCs w:val="19"/>
               </w:rPr>
-              <w:t xml:space="preserve">290</w:t>
+              <w:t xml:space="preserve">808</w:t>
             </w:r>
           </w:p>
         </w:tc>
@@ -6752,7 +6653,7 @@
                 <w:sz w:val="19"/>
                 <w:szCs w:val="19"/>
               </w:rPr>
-              <w:t xml:space="preserve">63.56%</w:t>
+              <w:t xml:space="preserve">65.45%</w:t>
             </w:r>
           </w:p>
         </w:tc>
@@ -6779,7 +6680,7 @@
                 <w:sz w:val="19"/>
                 <w:szCs w:val="19"/>
               </w:rPr>
-              <w:t xml:space="preserve">98.79%</w:t>
+              <w:t xml:space="preserve">99.00%</w:t>
             </w:r>
           </w:p>
         </w:tc>
@@ -6806,7 +6707,7 @@
                 <w:sz w:val="19"/>
                 <w:szCs w:val="19"/>
               </w:rPr>
-              <w:t xml:space="preserve">77.35%</w:t>
+              <w:t xml:space="preserve">78.81%</w:t>
             </w:r>
           </w:p>
         </w:tc>
@@ -6833,7 +6734,7 @@
                 <w:sz w:val="19"/>
                 <w:szCs w:val="19"/>
               </w:rPr>
-              <w:t xml:space="preserve">251</w:t>
+              <w:t xml:space="preserve">899</w:t>
             </w:r>
           </w:p>
         </w:tc>
@@ -7060,6 +6961,7 @@
     <w:p>
       <w:pPr>
         <w:pStyle w:val="Heading2"/>
+        <w:keepNext/>
         <w:spacing w:after="140" w:before="280"/>
       </w:pPr>
       <w:r>
@@ -7541,6 +7443,7 @@
     <w:p>
       <w:pPr>
         <w:pStyle w:val="Heading2"/>
+        <w:keepNext/>
         <w:spacing w:after="140" w:before="280"/>
       </w:pPr>
       <w:r>
@@ -8182,7 +8085,7 @@
                 <w:sz w:val="19"/>
                 <w:szCs w:val="19"/>
               </w:rPr>
-              <w:t xml:space="preserve">pycasa: YOLO26 + SORT (251f)</w:t>
+              <w:t xml:space="preserve">pycasa: YOLO26 + SORT (899f)</w:t>
             </w:r>
           </w:p>
         </w:tc>
@@ -8209,7 +8112,7 @@
                 <w:sz w:val="19"/>
                 <w:szCs w:val="19"/>
               </w:rPr>
-              <w:t xml:space="preserve">37.9</w:t>
+              <w:t xml:space="preserve">37.84</w:t>
             </w:r>
           </w:p>
         </w:tc>
@@ -8236,7 +8139,7 @@
                 <w:sz w:val="19"/>
                 <w:szCs w:val="19"/>
               </w:rPr>
-              <w:t xml:space="preserve">22.37</w:t>
+              <w:t xml:space="preserve">23.14</w:t>
             </w:r>
           </w:p>
         </w:tc>
@@ -8263,7 +8166,7 @@
                 <w:sz w:val="19"/>
                 <w:szCs w:val="19"/>
               </w:rPr>
-              <w:t xml:space="preserve">1.37</w:t>
+              <w:t xml:space="preserve">0.78</w:t>
             </w:r>
           </w:p>
         </w:tc>
@@ -8290,7 +8193,7 @@
                 <w:sz w:val="19"/>
                 <w:szCs w:val="19"/>
               </w:rPr>
-              <w:t xml:space="preserve">38.36</w:t>
+              <w:t xml:space="preserve">38.24</w:t>
             </w:r>
           </w:p>
         </w:tc>
@@ -8317,7 +8220,7 @@
                 <w:sz w:val="19"/>
                 <w:szCs w:val="19"/>
               </w:rPr>
-              <w:t xml:space="preserve">79.82</w:t>
+              <w:t xml:space="preserve">73.61</w:t>
             </w:r>
           </w:p>
         </w:tc>
@@ -8344,7 +8247,7 @@
                 <w:sz w:val="19"/>
                 <w:szCs w:val="19"/>
               </w:rPr>
-              <w:t xml:space="preserve">175.6</w:t>
+              <w:t xml:space="preserve">161.93</w:t>
             </w:r>
           </w:p>
         </w:tc>
@@ -8359,17 +8262,13 @@
           <w:sz w:val="21"/>
           <w:szCs w:val="21"/>
         </w:rPr>
-        <w:t xml:space="preserve">For ground truth with SORT the concentration error did not improve with more footage: 59.52 M/mL on 101 frames and 54.48 M/mL on 899 frames, against the machine's 69 M/mL, a 14 percent and 21 percent gap respectively. The motility grades did move: rapid rose from 49.55 to 56.43 percent and immotile fell from 20.72 to 18.5 percent, both moving away from the reference rather than towards it. Longer tracks let more cells accumulate enough displacement to be graded rapid, which suggests the 101-frame agreement on grades was partly coincidental.</w:t>
-      </w:r>
-    </w:p>
-    <w:p>
-      <w:r>
-        <w:br w:type="page"/>
+        <w:t xml:space="preserve">This is the overturned conclusion, and the two pipelines move in opposite directions. YOLO26 with SORT was 24 percent above the machine on 101 frames at 85.39 M/mL; on the full clip it lands at 73.61 M/mL against the machine's 69, an error of only 7 percent. Its immotile fraction also settles at 38.24 percent. More footage lets the tracker discard the short spurious tracks that false positives create, so the detector's weakness largely washes out at scale. Ground truth with SORT went the other way: 59.52 M/mL on 101 frames and 54.48 M/mL on the full clip, widening the gap from 14 to 21 percent. Its grades drifted too, with rapid rising from 49.55 to 56.43 percent and immotile falling from 20.72 to 18.5 percent, both away from the reference. Longer tracks give each cell more opportunity to accumulate displacement and be graded rapid, which means the close agreement seen on 101 frames was partly an artefact of the short window.</w:t>
       </w:r>
     </w:p>
     <w:p>
       <w:pPr>
         <w:pStyle w:val="Heading1"/>
+        <w:keepNext/>
         <w:spacing w:after="140" w:before="280"/>
       </w:pPr>
       <w:r>
@@ -9684,13 +9583,9 @@
       </w:r>
     </w:p>
     <w:p>
-      <w:r>
-        <w:br w:type="page"/>
-      </w:r>
-    </w:p>
-    <w:p>
       <w:pPr>
         <w:pStyle w:val="Heading1"/>
+        <w:keepNext/>
         <w:spacing w:after="140" w:before="280"/>
       </w:pPr>
       <w:r>
@@ -10515,6 +10410,7 @@
     <w:p>
       <w:pPr>
         <w:pStyle w:val="Heading2"/>
+        <w:keepNext/>
         <w:spacing w:after="140" w:before="280"/>
       </w:pPr>
       <w:r>
@@ -10740,7 +10636,7 @@
                 <w:sz w:val="19"/>
                 <w:szCs w:val="19"/>
               </w:rPr>
-              <w:t xml:space="preserve">Isolated, this machine</w:t>
+              <w:t xml:space="preserve">101 frames, isolated</w:t>
             </w:r>
           </w:p>
         </w:tc>
@@ -10877,7 +10773,7 @@
                 <w:sz w:val="19"/>
                 <w:szCs w:val="19"/>
               </w:rPr>
-              <w:t xml:space="preserve">After YOLOv5, this machine</w:t>
+              <w:t xml:space="preserve">101 frames, after YOLOv5</w:t>
             </w:r>
           </w:p>
         </w:tc>
@@ -11014,7 +10910,7 @@
                 <w:sz w:val="19"/>
                 <w:szCs w:val="19"/>
               </w:rPr>
-              <w:t xml:space="preserve">Independent run, different machine</w:t>
+              <w:t xml:space="preserve">101 frames, different machine</w:t>
             </w:r>
           </w:p>
         </w:tc>
@@ -11123,6 +11019,280 @@
                 <w:szCs w:val="19"/>
               </w:rPr>
               <w:t xml:space="preserve">83.10%</w:t>
+            </w:r>
+          </w:p>
+        </w:tc>
+      </w:tr>
+      <w:tr>
+        <w:tc>
+          <w:tcPr>
+            <w:tcW w:type="dxa" w:w="3744"/>
+            <w:shd w:fill="F5F8FB" w:val="clear"/>
+            <w:tcMar>
+              <w:top w:type="dxa" w:w="60"/>
+              <w:left w:type="dxa" w:w="90"/>
+              <w:bottom w:type="dxa" w:w="60"/>
+              <w:right w:type="dxa" w:w="90"/>
+            </w:tcMar>
+          </w:tcPr>
+          <w:p>
+            <w:pPr>
+              <w:spacing w:after="0"/>
+              <w:jc w:val="left"/>
+            </w:pPr>
+            <w:r>
+              <w:rPr>
+                <w:b/>
+                <w:bCs/>
+                <w:sz w:val="19"/>
+                <w:szCs w:val="19"/>
+              </w:rPr>
+              <w:t xml:space="preserve">Full clip, isolated</w:t>
+            </w:r>
+          </w:p>
+        </w:tc>
+        <w:tc>
+          <w:tcPr>
+            <w:tcW w:type="dxa" w:w="1404"/>
+            <w:shd w:fill="F5F8FB" w:val="clear"/>
+            <w:tcMar>
+              <w:top w:type="dxa" w:w="60"/>
+              <w:left w:type="dxa" w:w="90"/>
+              <w:bottom w:type="dxa" w:w="60"/>
+              <w:right w:type="dxa" w:w="90"/>
+            </w:tcMar>
+          </w:tcPr>
+          <w:p>
+            <w:pPr>
+              <w:spacing w:after="0"/>
+              <w:jc w:val="center"/>
+            </w:pPr>
+            <w:r>
+              <w:rPr>
+                <w:b w:val="false"/>
+                <w:bCs w:val="false"/>
+                <w:sz w:val="19"/>
+                <w:szCs w:val="19"/>
+              </w:rPr>
+              <w:t xml:space="preserve">80,271</w:t>
+            </w:r>
+          </w:p>
+        </w:tc>
+        <w:tc>
+          <w:tcPr>
+            <w:tcW w:type="dxa" w:w="1404"/>
+            <w:shd w:fill="F5F8FB" w:val="clear"/>
+            <w:tcMar>
+              <w:top w:type="dxa" w:w="60"/>
+              <w:left w:type="dxa" w:w="90"/>
+              <w:bottom w:type="dxa" w:w="60"/>
+              <w:right w:type="dxa" w:w="90"/>
+            </w:tcMar>
+          </w:tcPr>
+          <w:p>
+            <w:pPr>
+              <w:spacing w:after="0"/>
+              <w:jc w:val="center"/>
+            </w:pPr>
+            <w:r>
+              <w:rPr>
+                <w:b w:val="false"/>
+                <w:bCs w:val="false"/>
+                <w:sz w:val="19"/>
+                <w:szCs w:val="19"/>
+              </w:rPr>
+              <w:t xml:space="preserve">42,369</w:t>
+            </w:r>
+          </w:p>
+        </w:tc>
+        <w:tc>
+          <w:tcPr>
+            <w:tcW w:type="dxa" w:w="1404"/>
+            <w:shd w:fill="F5F8FB" w:val="clear"/>
+            <w:tcMar>
+              <w:top w:type="dxa" w:w="60"/>
+              <w:left w:type="dxa" w:w="90"/>
+              <w:bottom w:type="dxa" w:w="60"/>
+              <w:right w:type="dxa" w:w="90"/>
+            </w:tcMar>
+          </w:tcPr>
+          <w:p>
+            <w:pPr>
+              <w:spacing w:after="0"/>
+              <w:jc w:val="center"/>
+            </w:pPr>
+            <w:r>
+              <w:rPr>
+                <w:b w:val="false"/>
+                <w:bCs w:val="false"/>
+                <w:sz w:val="19"/>
+                <w:szCs w:val="19"/>
+              </w:rPr>
+              <w:t xml:space="preserve">808</w:t>
+            </w:r>
+          </w:p>
+        </w:tc>
+        <w:tc>
+          <w:tcPr>
+            <w:tcW w:type="dxa" w:w="1404"/>
+            <w:shd w:fill="F5F8FB" w:val="clear"/>
+            <w:tcMar>
+              <w:top w:type="dxa" w:w="60"/>
+              <w:left w:type="dxa" w:w="90"/>
+              <w:bottom w:type="dxa" w:w="60"/>
+              <w:right w:type="dxa" w:w="90"/>
+            </w:tcMar>
+          </w:tcPr>
+          <w:p>
+            <w:pPr>
+              <w:spacing w:after="0"/>
+              <w:jc w:val="center"/>
+            </w:pPr>
+            <w:r>
+              <w:rPr>
+                <w:b w:val="false"/>
+                <w:bCs w:val="false"/>
+                <w:sz w:val="19"/>
+                <w:szCs w:val="19"/>
+              </w:rPr>
+              <w:t xml:space="preserve">78.81%</w:t>
+            </w:r>
+          </w:p>
+        </w:tc>
+      </w:tr>
+      <w:tr>
+        <w:tc>
+          <w:tcPr>
+            <w:tcW w:type="dxa" w:w="3744"/>
+            <w:shd w:fill="FFFFFF" w:val="clear"/>
+            <w:tcMar>
+              <w:top w:type="dxa" w:w="60"/>
+              <w:left w:type="dxa" w:w="90"/>
+              <w:bottom w:type="dxa" w:w="60"/>
+              <w:right w:type="dxa" w:w="90"/>
+            </w:tcMar>
+          </w:tcPr>
+          <w:p>
+            <w:pPr>
+              <w:spacing w:after="0"/>
+              <w:jc w:val="left"/>
+            </w:pPr>
+            <w:r>
+              <w:rPr>
+                <w:b/>
+                <w:bCs/>
+                <w:sz w:val="19"/>
+                <w:szCs w:val="19"/>
+              </w:rPr>
+              <w:t xml:space="preserve">Full clip, different machine</w:t>
+            </w:r>
+          </w:p>
+        </w:tc>
+        <w:tc>
+          <w:tcPr>
+            <w:tcW w:type="dxa" w:w="1404"/>
+            <w:shd w:fill="FFFFFF" w:val="clear"/>
+            <w:tcMar>
+              <w:top w:type="dxa" w:w="60"/>
+              <w:left w:type="dxa" w:w="90"/>
+              <w:bottom w:type="dxa" w:w="60"/>
+              <w:right w:type="dxa" w:w="90"/>
+            </w:tcMar>
+          </w:tcPr>
+          <w:p>
+            <w:pPr>
+              <w:spacing w:after="0"/>
+              <w:jc w:val="center"/>
+            </w:pPr>
+            <w:r>
+              <w:rPr>
+                <w:b w:val="false"/>
+                <w:bCs w:val="false"/>
+                <w:sz w:val="19"/>
+                <w:szCs w:val="19"/>
+              </w:rPr>
+              <w:t xml:space="preserve">80,002</w:t>
+            </w:r>
+          </w:p>
+        </w:tc>
+        <w:tc>
+          <w:tcPr>
+            <w:tcW w:type="dxa" w:w="1404"/>
+            <w:shd w:fill="FFFFFF" w:val="clear"/>
+            <w:tcMar>
+              <w:top w:type="dxa" w:w="60"/>
+              <w:left w:type="dxa" w:w="90"/>
+              <w:bottom w:type="dxa" w:w="60"/>
+              <w:right w:type="dxa" w:w="90"/>
+            </w:tcMar>
+          </w:tcPr>
+          <w:p>
+            <w:pPr>
+              <w:spacing w:after="0"/>
+              <w:jc w:val="center"/>
+            </w:pPr>
+            <w:r>
+              <w:rPr>
+                <w:b w:val="false"/>
+                <w:bCs w:val="false"/>
+                <w:sz w:val="19"/>
+                <w:szCs w:val="19"/>
+              </w:rPr>
+              <w:t xml:space="preserve">27,806</w:t>
+            </w:r>
+          </w:p>
+        </w:tc>
+        <w:tc>
+          <w:tcPr>
+            <w:tcW w:type="dxa" w:w="1404"/>
+            <w:shd w:fill="FFFFFF" w:val="clear"/>
+            <w:tcMar>
+              <w:top w:type="dxa" w:w="60"/>
+              <w:left w:type="dxa" w:w="90"/>
+              <w:bottom w:type="dxa" w:w="60"/>
+              <w:right w:type="dxa" w:w="90"/>
+            </w:tcMar>
+          </w:tcPr>
+          <w:p>
+            <w:pPr>
+              <w:spacing w:after="0"/>
+              <w:jc w:val="center"/>
+            </w:pPr>
+            <w:r>
+              <w:rPr>
+                <w:b w:val="false"/>
+                <w:bCs w:val="false"/>
+                <w:sz w:val="19"/>
+                <w:szCs w:val="19"/>
+              </w:rPr>
+              <w:t xml:space="preserve">1,077</w:t>
+            </w:r>
+          </w:p>
+        </w:tc>
+        <w:tc>
+          <w:tcPr>
+            <w:tcW w:type="dxa" w:w="1404"/>
+            <w:shd w:fill="FFFFFF" w:val="clear"/>
+            <w:tcMar>
+              <w:top w:type="dxa" w:w="60"/>
+              <w:left w:type="dxa" w:w="90"/>
+              <w:bottom w:type="dxa" w:w="60"/>
+              <w:right w:type="dxa" w:w="90"/>
+            </w:tcMar>
+          </w:tcPr>
+          <w:p>
+            <w:pPr>
+              <w:spacing w:after="0"/>
+              <w:jc w:val="center"/>
+            </w:pPr>
+            <w:r>
+              <w:rPr>
+                <w:b w:val="false"/>
+                <w:bCs w:val="false"/>
+                <w:sz w:val="19"/>
+                <w:szCs w:val="19"/>
+              </w:rPr>
+              <w:t xml:space="preserve">84.71%</w:t>
             </w:r>
           </w:p>
         </w:tc>
@@ -11137,12 +11307,27 @@
           <w:sz w:val="21"/>
           <w:szCs w:val="21"/>
         </w:rPr>
-        <w:t xml:space="preserve">True positives agree to within three detections across all three runs while false positives span a 47 percent range. Any reported YOLO26 precision or F1 should therefore state the run conditions. The safe practice is to run each detector in a fresh process.</w:t>
+        <w:t xml:space="preserve">The pattern is consistent and it scales. On the 101-frame window, true positives agree to within three detections across three runs while false positives span a 47 percent range. On the full clip the agreement on true positives is still better than half a percent, 80,271 against 80,002, but the two runs differ by 14,563 false positives, a 52 percent spread. Recall is effectively identical in every run; precision is not.</w:t>
+      </w:r>
+    </w:p>
+    <w:p>
+      <w:pPr>
+        <w:spacing w:after="120" w:before="60"/>
+      </w:pPr>
+      <w:r>
+        <w:rPr>
+          <w:b/>
+          <w:bCs/>
+          <w:sz w:val="21"/>
+          <w:szCs w:val="21"/>
+        </w:rPr>
+        <w:t xml:space="preserve">The practical consequence is that a YOLO26 precision or F1 figure is not reproducible unless the run conditions are stated. F1 for the same model on the same data ranges from 77 to 85 percent across these five runs. Any benchmark table should record whether another detector ran first in the same process, and the safe practice is to run each detector in a fresh process.</w:t>
       </w:r>
     </w:p>
     <w:p>
       <w:pPr>
         <w:pStyle w:val="Heading2"/>
+        <w:keepNext/>
         <w:spacing w:after="140" w:before="280"/>
       </w:pPr>
       <w:r>
@@ -11181,13 +11366,9 @@
       </w:r>
     </w:p>
     <w:p>
-      <w:r>
-        <w:br w:type="page"/>
-      </w:r>
-    </w:p>
-    <w:p>
       <w:pPr>
         <w:pStyle w:val="Heading1"/>
+        <w:keepNext/>
         <w:spacing w:after="140" w:before="280"/>
       </w:pPr>
       <w:r>
@@ -11396,7 +11577,7 @@
           <w:sz w:val="21"/>
           <w:szCs w:val="21"/>
         </w:rPr>
-        <w:t xml:space="preserve">Loading the video as one contiguous array puts a hard ceiling on clip length. Chunked or memory-mapped loading would remove it.</w:t>
+        <w:t xml:space="preserve">The video is loaded as one contiguous array, so the usable clip length is bounded by the largest free memory block rather than by total memory. Chunked or memory-mapped loading would remove that coupling.</w:t>
       </w:r>
     </w:p>
     <w:p>
@@ -11422,12 +11603,13 @@
           <w:sz w:val="21"/>
           <w:szCs w:val="21"/>
         </w:rPr>
-        <w:t xml:space="preserve">Ground truth with SORT under-reports concentration by roughly a fifth, and more footage does not close the gap. Since these are the dataset's own annotations, the detector cannot be blamed. Two explanations are worth testing: the commercial machine may count cells the annotation protocol excludes, such as debris-adjacent or partially out-of-focus heads, or the imaged volume implied by um_per_px and chamber depth may not correspond to the volume the machine samples. Resolving this would tell the group whether pycasa's concentration output can be compared to a commercial report at all, or only to itself.</w:t>
+        <w:t xml:space="preserve">The two pipelines diverge, and only one of them behaves the way more data should make it behave. YOLO26 with SORT converges on the machine once the full clip is used, ending within 7 percent on concentration. Ground truth with SORT does the opposite: it under-reports by a fifth and the gap widens with more footage. Since these are the dataset's own annotations, the detector cannot be blamed for it. Two explanations are worth testing. The commercial machine may count cells that the annotation protocol excludes, such as debris-adjacent or partially out-of-focus heads, which would make the ground truth a systematically sparser count than the machine's. Alternatively the imaged volume implied by um_per_px and chamber depth may not match the volume the machine samples, which would be a calibration question rather than an annotation one. Resolving this matters because it decides whether pycasa's concentration output can be compared to a commercial report at all, or only to itself.</w:t>
       </w:r>
     </w:p>
     <w:p>
       <w:pPr>
         <w:pStyle w:val="Heading2"/>
+        <w:keepNext/>
         <w:spacing w:after="140" w:before="280"/>
       </w:pPr>
       <w:r>

</xml_diff>

<commit_message>
Add controlled 2x2 experiment isolating YOLOv5 import from OpenCV thread count
Thread count varied alone changes nothing (A=B, C=D); import varied with
threads held equal does change the result (B!=D). TP identical in all four.
Report now states the finding as sufficiency, not a diagnosed root cause.

Co-Authored-By: Claude Opus 5 <noreply@anthropic.com>
</commit_message>
<xml_diff>
--- a/pycasa_Testing_Report.docx
+++ b/pycasa_Testing_Report.docx
@@ -116,7 +116,7 @@
           <w:sz w:val="20"/>
           <w:szCs w:val="20"/>
         </w:rPr>
-        <w:t xml:space="preserve">20 September 2026</w:t>
+        <w:t xml:space="preserve">21 September 2026</w:t>
       </w:r>
     </w:p>
     <w:p>
@@ -10434,6 +10434,1031 @@
           <w:szCs w:val="21"/>
         </w:rPr>
         <w:t xml:space="preserve">YOLO26 returns different results depending on whether YOLOv5 ran earlier in the same Python process. This was narrowed down experimentally: merely importing the YOLOv5 repository modules is enough to change the outcome. OpenCV thread count and the confidence threshold were both ruled out as causes, so the import leaves global state that changes numerical behaviour.</w:t>
+      </w:r>
+    </w:p>
+    <w:p>
+      <w:pPr>
+        <w:spacing w:after="120" w:before="0"/>
+      </w:pPr>
+      <w:r>
+        <w:rPr>
+          <w:sz w:val="21"/>
+          <w:szCs w:val="21"/>
+        </w:rPr>
+        <w:t xml:space="preserve">The obvious candidate was OpenCV's thread count, which the YOLOv5 import drops from the default to one. That was tested directly rather than inferred, with a two-by-two design in which the import and the thread count were varied independently, each condition in its own process.</w:t>
+      </w:r>
+    </w:p>
+    <w:tbl>
+      <w:tblPr>
+        <w:tblW w:type="dxa" w:w="9360"/>
+        <w:tblBorders>
+          <w:top w:val="single" w:color="9BB7D4" w:sz="4"/>
+          <w:left w:val="single" w:color="9BB7D4" w:sz="4"/>
+          <w:bottom w:val="single" w:color="9BB7D4" w:sz="4"/>
+          <w:right w:val="single" w:color="9BB7D4" w:sz="4"/>
+          <w:insideH w:val="single" w:color="C9D8E8" w:sz="2"/>
+          <w:insideV w:val="single" w:color="C9D8E8" w:sz="2"/>
+        </w:tblBorders>
+      </w:tblPr>
+      <w:tblGrid>
+        <w:gridCol w:w="749"/>
+        <w:gridCol w:w="1685"/>
+        <w:gridCol w:w="1310"/>
+        <w:gridCol w:w="1498"/>
+        <w:gridCol w:w="1310"/>
+        <w:gridCol w:w="1310"/>
+        <w:gridCol w:w="1498"/>
+      </w:tblGrid>
+      <w:tr>
+        <w:trPr>
+          <w:tblHeader/>
+        </w:trPr>
+        <w:tc>
+          <w:tcPr>
+            <w:tcW w:type="dxa" w:w="749"/>
+            <w:shd w:fill="1F3864" w:val="clear"/>
+            <w:tcMar>
+              <w:top w:type="dxa" w:w="60"/>
+              <w:left w:type="dxa" w:w="90"/>
+              <w:bottom w:type="dxa" w:w="60"/>
+              <w:right w:type="dxa" w:w="90"/>
+            </w:tcMar>
+          </w:tcPr>
+          <w:p>
+            <w:pPr>
+              <w:spacing w:after="0"/>
+              <w:jc w:val="left"/>
+            </w:pPr>
+            <w:r>
+              <w:rPr>
+                <w:b/>
+                <w:bCs/>
+                <w:color w:val="FFFFFF"/>
+                <w:sz w:val="19"/>
+                <w:szCs w:val="19"/>
+              </w:rPr>
+              <w:t xml:space="preserve">Run</w:t>
+            </w:r>
+          </w:p>
+        </w:tc>
+        <w:tc>
+          <w:tcPr>
+            <w:tcW w:type="dxa" w:w="1685"/>
+            <w:shd w:fill="1F3864" w:val="clear"/>
+            <w:tcMar>
+              <w:top w:type="dxa" w:w="60"/>
+              <w:left w:type="dxa" w:w="90"/>
+              <w:bottom w:type="dxa" w:w="60"/>
+              <w:right w:type="dxa" w:w="90"/>
+            </w:tcMar>
+          </w:tcPr>
+          <w:p>
+            <w:pPr>
+              <w:spacing w:after="0"/>
+              <w:jc w:val="center"/>
+            </w:pPr>
+            <w:r>
+              <w:rPr>
+                <w:b/>
+                <w:bCs/>
+                <w:color w:val="FFFFFF"/>
+                <w:sz w:val="19"/>
+                <w:szCs w:val="19"/>
+              </w:rPr>
+              <w:t xml:space="preserve">YOLOv5 imported</w:t>
+            </w:r>
+          </w:p>
+        </w:tc>
+        <w:tc>
+          <w:tcPr>
+            <w:tcW w:type="dxa" w:w="1310"/>
+            <w:shd w:fill="1F3864" w:val="clear"/>
+            <w:tcMar>
+              <w:top w:type="dxa" w:w="60"/>
+              <w:left w:type="dxa" w:w="90"/>
+              <w:bottom w:type="dxa" w:w="60"/>
+              <w:right w:type="dxa" w:w="90"/>
+            </w:tcMar>
+          </w:tcPr>
+          <w:p>
+            <w:pPr>
+              <w:spacing w:after="0"/>
+              <w:jc w:val="center"/>
+            </w:pPr>
+            <w:r>
+              <w:rPr>
+                <w:b/>
+                <w:bCs/>
+                <w:color w:val="FFFFFF"/>
+                <w:sz w:val="19"/>
+                <w:szCs w:val="19"/>
+              </w:rPr>
+              <w:t xml:space="preserve">cv2 threads</w:t>
+            </w:r>
+          </w:p>
+        </w:tc>
+        <w:tc>
+          <w:tcPr>
+            <w:tcW w:type="dxa" w:w="1498"/>
+            <w:shd w:fill="1F3864" w:val="clear"/>
+            <w:tcMar>
+              <w:top w:type="dxa" w:w="60"/>
+              <w:left w:type="dxa" w:w="90"/>
+              <w:bottom w:type="dxa" w:w="60"/>
+              <w:right w:type="dxa" w:w="90"/>
+            </w:tcMar>
+          </w:tcPr>
+          <w:p>
+            <w:pPr>
+              <w:spacing w:after="0"/>
+              <w:jc w:val="center"/>
+            </w:pPr>
+            <w:r>
+              <w:rPr>
+                <w:b/>
+                <w:bCs/>
+                <w:color w:val="FFFFFF"/>
+                <w:sz w:val="19"/>
+                <w:szCs w:val="19"/>
+              </w:rPr>
+              <w:t xml:space="preserve">Detections</w:t>
+            </w:r>
+          </w:p>
+        </w:tc>
+        <w:tc>
+          <w:tcPr>
+            <w:tcW w:type="dxa" w:w="1310"/>
+            <w:shd w:fill="1F3864" w:val="clear"/>
+            <w:tcMar>
+              <w:top w:type="dxa" w:w="60"/>
+              <w:left w:type="dxa" w:w="90"/>
+              <w:bottom w:type="dxa" w:w="60"/>
+              <w:right w:type="dxa" w:w="90"/>
+            </w:tcMar>
+          </w:tcPr>
+          <w:p>
+            <w:pPr>
+              <w:spacing w:after="0"/>
+              <w:jc w:val="center"/>
+            </w:pPr>
+            <w:r>
+              <w:rPr>
+                <w:b/>
+                <w:bCs/>
+                <w:color w:val="FFFFFF"/>
+                <w:sz w:val="19"/>
+                <w:szCs w:val="19"/>
+              </w:rPr>
+              <w:t xml:space="preserve">TP</w:t>
+            </w:r>
+          </w:p>
+        </w:tc>
+        <w:tc>
+          <w:tcPr>
+            <w:tcW w:type="dxa" w:w="1310"/>
+            <w:shd w:fill="1F3864" w:val="clear"/>
+            <w:tcMar>
+              <w:top w:type="dxa" w:w="60"/>
+              <w:left w:type="dxa" w:w="90"/>
+              <w:bottom w:type="dxa" w:w="60"/>
+              <w:right w:type="dxa" w:w="90"/>
+            </w:tcMar>
+          </w:tcPr>
+          <w:p>
+            <w:pPr>
+              <w:spacing w:after="0"/>
+              <w:jc w:val="center"/>
+            </w:pPr>
+            <w:r>
+              <w:rPr>
+                <w:b/>
+                <w:bCs/>
+                <w:color w:val="FFFFFF"/>
+                <w:sz w:val="19"/>
+                <w:szCs w:val="19"/>
+              </w:rPr>
+              <w:t xml:space="preserve">FP</w:t>
+            </w:r>
+          </w:p>
+        </w:tc>
+        <w:tc>
+          <w:tcPr>
+            <w:tcW w:type="dxa" w:w="1498"/>
+            <w:shd w:fill="1F3864" w:val="clear"/>
+            <w:tcMar>
+              <w:top w:type="dxa" w:w="60"/>
+              <w:left w:type="dxa" w:w="90"/>
+              <w:bottom w:type="dxa" w:w="60"/>
+              <w:right w:type="dxa" w:w="90"/>
+            </w:tcMar>
+          </w:tcPr>
+          <w:p>
+            <w:pPr>
+              <w:spacing w:after="0"/>
+              <w:jc w:val="center"/>
+            </w:pPr>
+            <w:r>
+              <w:rPr>
+                <w:b/>
+                <w:bCs/>
+                <w:color w:val="FFFFFF"/>
+                <w:sz w:val="19"/>
+                <w:szCs w:val="19"/>
+              </w:rPr>
+              <w:t xml:space="preserve">F1</w:t>
+            </w:r>
+          </w:p>
+        </w:tc>
+      </w:tr>
+      <w:tr>
+        <w:tc>
+          <w:tcPr>
+            <w:tcW w:type="dxa" w:w="749"/>
+            <w:shd w:fill="FFFFFF" w:val="clear"/>
+            <w:tcMar>
+              <w:top w:type="dxa" w:w="60"/>
+              <w:left w:type="dxa" w:w="90"/>
+              <w:bottom w:type="dxa" w:w="60"/>
+              <w:right w:type="dxa" w:w="90"/>
+            </w:tcMar>
+          </w:tcPr>
+          <w:p>
+            <w:pPr>
+              <w:spacing w:after="0"/>
+              <w:jc w:val="left"/>
+            </w:pPr>
+            <w:r>
+              <w:rPr>
+                <w:b/>
+                <w:bCs/>
+                <w:sz w:val="19"/>
+                <w:szCs w:val="19"/>
+              </w:rPr>
+              <w:t xml:space="preserve">A</w:t>
+            </w:r>
+          </w:p>
+        </w:tc>
+        <w:tc>
+          <w:tcPr>
+            <w:tcW w:type="dxa" w:w="1685"/>
+            <w:shd w:fill="FFFFFF" w:val="clear"/>
+            <w:tcMar>
+              <w:top w:type="dxa" w:w="60"/>
+              <w:left w:type="dxa" w:w="90"/>
+              <w:bottom w:type="dxa" w:w="60"/>
+              <w:right w:type="dxa" w:w="90"/>
+            </w:tcMar>
+          </w:tcPr>
+          <w:p>
+            <w:pPr>
+              <w:spacing w:after="0"/>
+              <w:jc w:val="center"/>
+            </w:pPr>
+            <w:r>
+              <w:rPr>
+                <w:b w:val="false"/>
+                <w:bCs w:val="false"/>
+                <w:sz w:val="19"/>
+                <w:szCs w:val="19"/>
+              </w:rPr>
+              <w:t xml:space="preserve">no</w:t>
+            </w:r>
+          </w:p>
+        </w:tc>
+        <w:tc>
+          <w:tcPr>
+            <w:tcW w:type="dxa" w:w="1310"/>
+            <w:shd w:fill="FFFFFF" w:val="clear"/>
+            <w:tcMar>
+              <w:top w:type="dxa" w:w="60"/>
+              <w:left w:type="dxa" w:w="90"/>
+              <w:bottom w:type="dxa" w:w="60"/>
+              <w:right w:type="dxa" w:w="90"/>
+            </w:tcMar>
+          </w:tcPr>
+          <w:p>
+            <w:pPr>
+              <w:spacing w:after="0"/>
+              <w:jc w:val="center"/>
+            </w:pPr>
+            <w:r>
+              <w:rPr>
+                <w:b w:val="false"/>
+                <w:bCs w:val="false"/>
+                <w:sz w:val="19"/>
+                <w:szCs w:val="19"/>
+              </w:rPr>
+              <w:t xml:space="preserve">16</w:t>
+            </w:r>
+          </w:p>
+        </w:tc>
+        <w:tc>
+          <w:tcPr>
+            <w:tcW w:type="dxa" w:w="1498"/>
+            <w:shd w:fill="FFFFFF" w:val="clear"/>
+            <w:tcMar>
+              <w:top w:type="dxa" w:w="60"/>
+              <w:left w:type="dxa" w:w="90"/>
+              <w:bottom w:type="dxa" w:w="60"/>
+              <w:right w:type="dxa" w:w="90"/>
+            </w:tcMar>
+          </w:tcPr>
+          <w:p>
+            <w:pPr>
+              <w:spacing w:after="0"/>
+              <w:jc w:val="center"/>
+            </w:pPr>
+            <w:r>
+              <w:rPr>
+                <w:b w:val="false"/>
+                <w:bCs w:val="false"/>
+                <w:sz w:val="19"/>
+                <w:szCs w:val="19"/>
+              </w:rPr>
+              <w:t xml:space="preserve">6,390</w:t>
+            </w:r>
+          </w:p>
+        </w:tc>
+        <w:tc>
+          <w:tcPr>
+            <w:tcW w:type="dxa" w:w="1310"/>
+            <w:shd w:fill="FFFFFF" w:val="clear"/>
+            <w:tcMar>
+              <w:top w:type="dxa" w:w="60"/>
+              <w:left w:type="dxa" w:w="90"/>
+              <w:bottom w:type="dxa" w:w="60"/>
+              <w:right w:type="dxa" w:w="90"/>
+            </w:tcMar>
+          </w:tcPr>
+          <w:p>
+            <w:pPr>
+              <w:spacing w:after="0"/>
+              <w:jc w:val="center"/>
+            </w:pPr>
+            <w:r>
+              <w:rPr>
+                <w:b w:val="false"/>
+                <w:bCs w:val="false"/>
+                <w:sz w:val="19"/>
+                <w:szCs w:val="19"/>
+              </w:rPr>
+              <w:t xml:space="preserve">4,120</w:t>
+            </w:r>
+          </w:p>
+        </w:tc>
+        <w:tc>
+          <w:tcPr>
+            <w:tcW w:type="dxa" w:w="1310"/>
+            <w:shd w:fill="FFFFFF" w:val="clear"/>
+            <w:tcMar>
+              <w:top w:type="dxa" w:w="60"/>
+              <w:left w:type="dxa" w:w="90"/>
+              <w:bottom w:type="dxa" w:w="60"/>
+              <w:right w:type="dxa" w:w="90"/>
+            </w:tcMar>
+          </w:tcPr>
+          <w:p>
+            <w:pPr>
+              <w:spacing w:after="0"/>
+              <w:jc w:val="center"/>
+            </w:pPr>
+            <w:r>
+              <w:rPr>
+                <w:b w:val="false"/>
+                <w:bCs w:val="false"/>
+                <w:sz w:val="19"/>
+                <w:szCs w:val="19"/>
+              </w:rPr>
+              <w:t xml:space="preserve">2,270</w:t>
+            </w:r>
+          </w:p>
+        </w:tc>
+        <w:tc>
+          <w:tcPr>
+            <w:tcW w:type="dxa" w:w="1498"/>
+            <w:shd w:fill="FFFFFF" w:val="clear"/>
+            <w:tcMar>
+              <w:top w:type="dxa" w:w="60"/>
+              <w:left w:type="dxa" w:w="90"/>
+              <w:bottom w:type="dxa" w:w="60"/>
+              <w:right w:type="dxa" w:w="90"/>
+            </w:tcMar>
+          </w:tcPr>
+          <w:p>
+            <w:pPr>
+              <w:spacing w:after="0"/>
+              <w:jc w:val="center"/>
+            </w:pPr>
+            <w:r>
+              <w:rPr>
+                <w:b w:val="false"/>
+                <w:bCs w:val="false"/>
+                <w:sz w:val="19"/>
+                <w:szCs w:val="19"/>
+              </w:rPr>
+              <w:t xml:space="preserve">78.00%</w:t>
+            </w:r>
+          </w:p>
+        </w:tc>
+      </w:tr>
+      <w:tr>
+        <w:tc>
+          <w:tcPr>
+            <w:tcW w:type="dxa" w:w="749"/>
+            <w:shd w:fill="F5F8FB" w:val="clear"/>
+            <w:tcMar>
+              <w:top w:type="dxa" w:w="60"/>
+              <w:left w:type="dxa" w:w="90"/>
+              <w:bottom w:type="dxa" w:w="60"/>
+              <w:right w:type="dxa" w:w="90"/>
+            </w:tcMar>
+          </w:tcPr>
+          <w:p>
+            <w:pPr>
+              <w:spacing w:after="0"/>
+              <w:jc w:val="left"/>
+            </w:pPr>
+            <w:r>
+              <w:rPr>
+                <w:b/>
+                <w:bCs/>
+                <w:sz w:val="19"/>
+                <w:szCs w:val="19"/>
+              </w:rPr>
+              <w:t xml:space="preserve">B</w:t>
+            </w:r>
+          </w:p>
+        </w:tc>
+        <w:tc>
+          <w:tcPr>
+            <w:tcW w:type="dxa" w:w="1685"/>
+            <w:shd w:fill="F5F8FB" w:val="clear"/>
+            <w:tcMar>
+              <w:top w:type="dxa" w:w="60"/>
+              <w:left w:type="dxa" w:w="90"/>
+              <w:bottom w:type="dxa" w:w="60"/>
+              <w:right w:type="dxa" w:w="90"/>
+            </w:tcMar>
+          </w:tcPr>
+          <w:p>
+            <w:pPr>
+              <w:spacing w:after="0"/>
+              <w:jc w:val="center"/>
+            </w:pPr>
+            <w:r>
+              <w:rPr>
+                <w:b w:val="false"/>
+                <w:bCs w:val="false"/>
+                <w:sz w:val="19"/>
+                <w:szCs w:val="19"/>
+              </w:rPr>
+              <w:t xml:space="preserve">no</w:t>
+            </w:r>
+          </w:p>
+        </w:tc>
+        <w:tc>
+          <w:tcPr>
+            <w:tcW w:type="dxa" w:w="1310"/>
+            <w:shd w:fill="F5F8FB" w:val="clear"/>
+            <w:tcMar>
+              <w:top w:type="dxa" w:w="60"/>
+              <w:left w:type="dxa" w:w="90"/>
+              <w:bottom w:type="dxa" w:w="60"/>
+              <w:right w:type="dxa" w:w="90"/>
+            </w:tcMar>
+          </w:tcPr>
+          <w:p>
+            <w:pPr>
+              <w:spacing w:after="0"/>
+              <w:jc w:val="center"/>
+            </w:pPr>
+            <w:r>
+              <w:rPr>
+                <w:b w:val="false"/>
+                <w:bCs w:val="false"/>
+                <w:sz w:val="19"/>
+                <w:szCs w:val="19"/>
+              </w:rPr>
+              <w:t xml:space="preserve">1</w:t>
+            </w:r>
+          </w:p>
+        </w:tc>
+        <w:tc>
+          <w:tcPr>
+            <w:tcW w:type="dxa" w:w="1498"/>
+            <w:shd w:fill="F5F8FB" w:val="clear"/>
+            <w:tcMar>
+              <w:top w:type="dxa" w:w="60"/>
+              <w:left w:type="dxa" w:w="90"/>
+              <w:bottom w:type="dxa" w:w="60"/>
+              <w:right w:type="dxa" w:w="90"/>
+            </w:tcMar>
+          </w:tcPr>
+          <w:p>
+            <w:pPr>
+              <w:spacing w:after="0"/>
+              <w:jc w:val="center"/>
+            </w:pPr>
+            <w:r>
+              <w:rPr>
+                <w:b w:val="false"/>
+                <w:bCs w:val="false"/>
+                <w:sz w:val="19"/>
+                <w:szCs w:val="19"/>
+              </w:rPr>
+              <w:t xml:space="preserve">6,390</w:t>
+            </w:r>
+          </w:p>
+        </w:tc>
+        <w:tc>
+          <w:tcPr>
+            <w:tcW w:type="dxa" w:w="1310"/>
+            <w:shd w:fill="F5F8FB" w:val="clear"/>
+            <w:tcMar>
+              <w:top w:type="dxa" w:w="60"/>
+              <w:left w:type="dxa" w:w="90"/>
+              <w:bottom w:type="dxa" w:w="60"/>
+              <w:right w:type="dxa" w:w="90"/>
+            </w:tcMar>
+          </w:tcPr>
+          <w:p>
+            <w:pPr>
+              <w:spacing w:after="0"/>
+              <w:jc w:val="center"/>
+            </w:pPr>
+            <w:r>
+              <w:rPr>
+                <w:b w:val="false"/>
+                <w:bCs w:val="false"/>
+                <w:sz w:val="19"/>
+                <w:szCs w:val="19"/>
+              </w:rPr>
+              <w:t xml:space="preserve">4,120</w:t>
+            </w:r>
+          </w:p>
+        </w:tc>
+        <w:tc>
+          <w:tcPr>
+            <w:tcW w:type="dxa" w:w="1310"/>
+            <w:shd w:fill="F5F8FB" w:val="clear"/>
+            <w:tcMar>
+              <w:top w:type="dxa" w:w="60"/>
+              <w:left w:type="dxa" w:w="90"/>
+              <w:bottom w:type="dxa" w:w="60"/>
+              <w:right w:type="dxa" w:w="90"/>
+            </w:tcMar>
+          </w:tcPr>
+          <w:p>
+            <w:pPr>
+              <w:spacing w:after="0"/>
+              <w:jc w:val="center"/>
+            </w:pPr>
+            <w:r>
+              <w:rPr>
+                <w:b w:val="false"/>
+                <w:bCs w:val="false"/>
+                <w:sz w:val="19"/>
+                <w:szCs w:val="19"/>
+              </w:rPr>
+              <w:t xml:space="preserve">2,270</w:t>
+            </w:r>
+          </w:p>
+        </w:tc>
+        <w:tc>
+          <w:tcPr>
+            <w:tcW w:type="dxa" w:w="1498"/>
+            <w:shd w:fill="F5F8FB" w:val="clear"/>
+            <w:tcMar>
+              <w:top w:type="dxa" w:w="60"/>
+              <w:left w:type="dxa" w:w="90"/>
+              <w:bottom w:type="dxa" w:w="60"/>
+              <w:right w:type="dxa" w:w="90"/>
+            </w:tcMar>
+          </w:tcPr>
+          <w:p>
+            <w:pPr>
+              <w:spacing w:after="0"/>
+              <w:jc w:val="center"/>
+            </w:pPr>
+            <w:r>
+              <w:rPr>
+                <w:b w:val="false"/>
+                <w:bCs w:val="false"/>
+                <w:sz w:val="19"/>
+                <w:szCs w:val="19"/>
+              </w:rPr>
+              <w:t xml:space="preserve">78.00%</w:t>
+            </w:r>
+          </w:p>
+        </w:tc>
+      </w:tr>
+      <w:tr>
+        <w:tc>
+          <w:tcPr>
+            <w:tcW w:type="dxa" w:w="749"/>
+            <w:shd w:fill="FFFFFF" w:val="clear"/>
+            <w:tcMar>
+              <w:top w:type="dxa" w:w="60"/>
+              <w:left w:type="dxa" w:w="90"/>
+              <w:bottom w:type="dxa" w:w="60"/>
+              <w:right w:type="dxa" w:w="90"/>
+            </w:tcMar>
+          </w:tcPr>
+          <w:p>
+            <w:pPr>
+              <w:spacing w:after="0"/>
+              <w:jc w:val="left"/>
+            </w:pPr>
+            <w:r>
+              <w:rPr>
+                <w:b/>
+                <w:bCs/>
+                <w:sz w:val="19"/>
+                <w:szCs w:val="19"/>
+              </w:rPr>
+              <w:t xml:space="preserve">C</w:t>
+            </w:r>
+          </w:p>
+        </w:tc>
+        <w:tc>
+          <w:tcPr>
+            <w:tcW w:type="dxa" w:w="1685"/>
+            <w:shd w:fill="FFFFFF" w:val="clear"/>
+            <w:tcMar>
+              <w:top w:type="dxa" w:w="60"/>
+              <w:left w:type="dxa" w:w="90"/>
+              <w:bottom w:type="dxa" w:w="60"/>
+              <w:right w:type="dxa" w:w="90"/>
+            </w:tcMar>
+          </w:tcPr>
+          <w:p>
+            <w:pPr>
+              <w:spacing w:after="0"/>
+              <w:jc w:val="center"/>
+            </w:pPr>
+            <w:r>
+              <w:rPr>
+                <w:b w:val="false"/>
+                <w:bCs w:val="false"/>
+                <w:sz w:val="19"/>
+                <w:szCs w:val="19"/>
+              </w:rPr>
+              <w:t xml:space="preserve">yes</w:t>
+            </w:r>
+          </w:p>
+        </w:tc>
+        <w:tc>
+          <w:tcPr>
+            <w:tcW w:type="dxa" w:w="1310"/>
+            <w:shd w:fill="FFFFFF" w:val="clear"/>
+            <w:tcMar>
+              <w:top w:type="dxa" w:w="60"/>
+              <w:left w:type="dxa" w:w="90"/>
+              <w:bottom w:type="dxa" w:w="60"/>
+              <w:right w:type="dxa" w:w="90"/>
+            </w:tcMar>
+          </w:tcPr>
+          <w:p>
+            <w:pPr>
+              <w:spacing w:after="0"/>
+              <w:jc w:val="center"/>
+            </w:pPr>
+            <w:r>
+              <w:rPr>
+                <w:b w:val="false"/>
+                <w:bCs w:val="false"/>
+                <w:sz w:val="19"/>
+                <w:szCs w:val="19"/>
+              </w:rPr>
+              <w:t xml:space="preserve">1</w:t>
+            </w:r>
+          </w:p>
+        </w:tc>
+        <w:tc>
+          <w:tcPr>
+            <w:tcW w:type="dxa" w:w="1498"/>
+            <w:shd w:fill="FFFFFF" w:val="clear"/>
+            <w:tcMar>
+              <w:top w:type="dxa" w:w="60"/>
+              <w:left w:type="dxa" w:w="90"/>
+              <w:bottom w:type="dxa" w:w="60"/>
+              <w:right w:type="dxa" w:w="90"/>
+            </w:tcMar>
+          </w:tcPr>
+          <w:p>
+            <w:pPr>
+              <w:spacing w:after="0"/>
+              <w:jc w:val="center"/>
+            </w:pPr>
+            <w:r>
+              <w:rPr>
+                <w:b w:val="false"/>
+                <w:bCs w:val="false"/>
+                <w:sz w:val="19"/>
+                <w:szCs w:val="19"/>
+              </w:rPr>
+              <w:t xml:space="preserve">6,003</w:t>
+            </w:r>
+          </w:p>
+        </w:tc>
+        <w:tc>
+          <w:tcPr>
+            <w:tcW w:type="dxa" w:w="1310"/>
+            <w:shd w:fill="FFFFFF" w:val="clear"/>
+            <w:tcMar>
+              <w:top w:type="dxa" w:w="60"/>
+              <w:left w:type="dxa" w:w="90"/>
+              <w:bottom w:type="dxa" w:w="60"/>
+              <w:right w:type="dxa" w:w="90"/>
+            </w:tcMar>
+          </w:tcPr>
+          <w:p>
+            <w:pPr>
+              <w:spacing w:after="0"/>
+              <w:jc w:val="center"/>
+            </w:pPr>
+            <w:r>
+              <w:rPr>
+                <w:b w:val="false"/>
+                <w:bCs w:val="false"/>
+                <w:sz w:val="19"/>
+                <w:szCs w:val="19"/>
+              </w:rPr>
+              <w:t xml:space="preserve">4,120</w:t>
+            </w:r>
+          </w:p>
+        </w:tc>
+        <w:tc>
+          <w:tcPr>
+            <w:tcW w:type="dxa" w:w="1310"/>
+            <w:shd w:fill="FFFFFF" w:val="clear"/>
+            <w:tcMar>
+              <w:top w:type="dxa" w:w="60"/>
+              <w:left w:type="dxa" w:w="90"/>
+              <w:bottom w:type="dxa" w:w="60"/>
+              <w:right w:type="dxa" w:w="90"/>
+            </w:tcMar>
+          </w:tcPr>
+          <w:p>
+            <w:pPr>
+              <w:spacing w:after="0"/>
+              <w:jc w:val="center"/>
+            </w:pPr>
+            <w:r>
+              <w:rPr>
+                <w:b w:val="false"/>
+                <w:bCs w:val="false"/>
+                <w:sz w:val="19"/>
+                <w:szCs w:val="19"/>
+              </w:rPr>
+              <w:t xml:space="preserve">1,883</w:t>
+            </w:r>
+          </w:p>
+        </w:tc>
+        <w:tc>
+          <w:tcPr>
+            <w:tcW w:type="dxa" w:w="1498"/>
+            <w:shd w:fill="FFFFFF" w:val="clear"/>
+            <w:tcMar>
+              <w:top w:type="dxa" w:w="60"/>
+              <w:left w:type="dxa" w:w="90"/>
+              <w:bottom w:type="dxa" w:w="60"/>
+              <w:right w:type="dxa" w:w="90"/>
+            </w:tcMar>
+          </w:tcPr>
+          <w:p>
+            <w:pPr>
+              <w:spacing w:after="0"/>
+              <w:jc w:val="center"/>
+            </w:pPr>
+            <w:r>
+              <w:rPr>
+                <w:b w:val="false"/>
+                <w:bCs w:val="false"/>
+                <w:sz w:val="19"/>
+                <w:szCs w:val="19"/>
+              </w:rPr>
+              <w:t xml:space="preserve">80.97%</w:t>
+            </w:r>
+          </w:p>
+        </w:tc>
+      </w:tr>
+      <w:tr>
+        <w:tc>
+          <w:tcPr>
+            <w:tcW w:type="dxa" w:w="749"/>
+            <w:shd w:fill="F5F8FB" w:val="clear"/>
+            <w:tcMar>
+              <w:top w:type="dxa" w:w="60"/>
+              <w:left w:type="dxa" w:w="90"/>
+              <w:bottom w:type="dxa" w:w="60"/>
+              <w:right w:type="dxa" w:w="90"/>
+            </w:tcMar>
+          </w:tcPr>
+          <w:p>
+            <w:pPr>
+              <w:spacing w:after="0"/>
+              <w:jc w:val="left"/>
+            </w:pPr>
+            <w:r>
+              <w:rPr>
+                <w:b/>
+                <w:bCs/>
+                <w:sz w:val="19"/>
+                <w:szCs w:val="19"/>
+              </w:rPr>
+              <w:t xml:space="preserve">D</w:t>
+            </w:r>
+          </w:p>
+        </w:tc>
+        <w:tc>
+          <w:tcPr>
+            <w:tcW w:type="dxa" w:w="1685"/>
+            <w:shd w:fill="F5F8FB" w:val="clear"/>
+            <w:tcMar>
+              <w:top w:type="dxa" w:w="60"/>
+              <w:left w:type="dxa" w:w="90"/>
+              <w:bottom w:type="dxa" w:w="60"/>
+              <w:right w:type="dxa" w:w="90"/>
+            </w:tcMar>
+          </w:tcPr>
+          <w:p>
+            <w:pPr>
+              <w:spacing w:after="0"/>
+              <w:jc w:val="center"/>
+            </w:pPr>
+            <w:r>
+              <w:rPr>
+                <w:b w:val="false"/>
+                <w:bCs w:val="false"/>
+                <w:sz w:val="19"/>
+                <w:szCs w:val="19"/>
+              </w:rPr>
+              <w:t xml:space="preserve">yes</w:t>
+            </w:r>
+          </w:p>
+        </w:tc>
+        <w:tc>
+          <w:tcPr>
+            <w:tcW w:type="dxa" w:w="1310"/>
+            <w:shd w:fill="F5F8FB" w:val="clear"/>
+            <w:tcMar>
+              <w:top w:type="dxa" w:w="60"/>
+              <w:left w:type="dxa" w:w="90"/>
+              <w:bottom w:type="dxa" w:w="60"/>
+              <w:right w:type="dxa" w:w="90"/>
+            </w:tcMar>
+          </w:tcPr>
+          <w:p>
+            <w:pPr>
+              <w:spacing w:after="0"/>
+              <w:jc w:val="center"/>
+            </w:pPr>
+            <w:r>
+              <w:rPr>
+                <w:b w:val="false"/>
+                <w:bCs w:val="false"/>
+                <w:sz w:val="19"/>
+                <w:szCs w:val="19"/>
+              </w:rPr>
+              <w:t xml:space="preserve">16</w:t>
+            </w:r>
+          </w:p>
+        </w:tc>
+        <w:tc>
+          <w:tcPr>
+            <w:tcW w:type="dxa" w:w="1498"/>
+            <w:shd w:fill="F5F8FB" w:val="clear"/>
+            <w:tcMar>
+              <w:top w:type="dxa" w:w="60"/>
+              <w:left w:type="dxa" w:w="90"/>
+              <w:bottom w:type="dxa" w:w="60"/>
+              <w:right w:type="dxa" w:w="90"/>
+            </w:tcMar>
+          </w:tcPr>
+          <w:p>
+            <w:pPr>
+              <w:spacing w:after="0"/>
+              <w:jc w:val="center"/>
+            </w:pPr>
+            <w:r>
+              <w:rPr>
+                <w:b w:val="false"/>
+                <w:bCs w:val="false"/>
+                <w:sz w:val="19"/>
+                <w:szCs w:val="19"/>
+              </w:rPr>
+              <w:t xml:space="preserve">6,003</w:t>
+            </w:r>
+          </w:p>
+        </w:tc>
+        <w:tc>
+          <w:tcPr>
+            <w:tcW w:type="dxa" w:w="1310"/>
+            <w:shd w:fill="F5F8FB" w:val="clear"/>
+            <w:tcMar>
+              <w:top w:type="dxa" w:w="60"/>
+              <w:left w:type="dxa" w:w="90"/>
+              <w:bottom w:type="dxa" w:w="60"/>
+              <w:right w:type="dxa" w:w="90"/>
+            </w:tcMar>
+          </w:tcPr>
+          <w:p>
+            <w:pPr>
+              <w:spacing w:after="0"/>
+              <w:jc w:val="center"/>
+            </w:pPr>
+            <w:r>
+              <w:rPr>
+                <w:b w:val="false"/>
+                <w:bCs w:val="false"/>
+                <w:sz w:val="19"/>
+                <w:szCs w:val="19"/>
+              </w:rPr>
+              <w:t xml:space="preserve">4,120</w:t>
+            </w:r>
+          </w:p>
+        </w:tc>
+        <w:tc>
+          <w:tcPr>
+            <w:tcW w:type="dxa" w:w="1310"/>
+            <w:shd w:fill="F5F8FB" w:val="clear"/>
+            <w:tcMar>
+              <w:top w:type="dxa" w:w="60"/>
+              <w:left w:type="dxa" w:w="90"/>
+              <w:bottom w:type="dxa" w:w="60"/>
+              <w:right w:type="dxa" w:w="90"/>
+            </w:tcMar>
+          </w:tcPr>
+          <w:p>
+            <w:pPr>
+              <w:spacing w:after="0"/>
+              <w:jc w:val="center"/>
+            </w:pPr>
+            <w:r>
+              <w:rPr>
+                <w:b w:val="false"/>
+                <w:bCs w:val="false"/>
+                <w:sz w:val="19"/>
+                <w:szCs w:val="19"/>
+              </w:rPr>
+              <w:t xml:space="preserve">1,883</w:t>
+            </w:r>
+          </w:p>
+        </w:tc>
+        <w:tc>
+          <w:tcPr>
+            <w:tcW w:type="dxa" w:w="1498"/>
+            <w:shd w:fill="F5F8FB" w:val="clear"/>
+            <w:tcMar>
+              <w:top w:type="dxa" w:w="60"/>
+              <w:left w:type="dxa" w:w="90"/>
+              <w:bottom w:type="dxa" w:w="60"/>
+              <w:right w:type="dxa" w:w="90"/>
+            </w:tcMar>
+          </w:tcPr>
+          <w:p>
+            <w:pPr>
+              <w:spacing w:after="0"/>
+              <w:jc w:val="center"/>
+            </w:pPr>
+            <w:r>
+              <w:rPr>
+                <w:b w:val="false"/>
+                <w:bCs w:val="false"/>
+                <w:sz w:val="19"/>
+                <w:szCs w:val="19"/>
+              </w:rPr>
+              <w:t xml:space="preserve">80.97%</w:t>
+            </w:r>
+          </w:p>
+        </w:tc>
+      </w:tr>
+    </w:tbl>
+    <w:p>
+      <w:pPr>
+        <w:spacing w:after="120" w:before="70"/>
+      </w:pPr>
+      <w:r>
+        <w:rPr>
+          <w:sz w:val="21"/>
+          <w:szCs w:val="21"/>
+        </w:rPr>
+        <w:t xml:space="preserve">Varying the thread count on its own changes nothing: A and B are identical, and so are C and D. Varying the import with the thread count held equal does change the result: B against D differs by 387 detections. True positives are 4,120 in all four conditions. Thread count is therefore not the mechanism, and the import is sufficient on its own.</w:t>
+      </w:r>
+    </w:p>
+    <w:p>
+      <w:pPr>
+        <w:spacing w:after="120" w:before="60"/>
+      </w:pPr>
+      <w:r>
+        <w:rPr>
+          <w:i/>
+          <w:iCs/>
+          <w:sz w:val="21"/>
+          <w:szCs w:val="21"/>
+        </w:rPr>
+        <w:t xml:space="preserve">What this does not establish is which piece of global state the import leaves behind. The confidence threshold was also ruled out, since passing an explicit conf still shifts the result. Identifying the specific mechanism would require bisecting the YOLOv5 package imports, which was out of scope here. The finding should be read as: importing YOLOv5 is sufficient to change YOLO26 output. It is not a diagnosed root cause.</w:t>
       </w:r>
     </w:p>
     <w:p>

</xml_diff>

<commit_message>
Eliminate five more candidate causes for the YOLO26 ordering defect
Tested and ruled out: module shadowing, environment variables, torch global
flags, NMS monkey-patching, confidence threshold. Mechanism remains
unidentified; report states the finding as sufficiency.

Co-Authored-By: Claude Opus 5 <noreply@anthropic.com>
</commit_message>
<xml_diff>
--- a/pycasa_Testing_Report.docx
+++ b/pycasa_Testing_Report.docx
@@ -11449,7 +11449,104 @@
     </w:p>
     <w:p>
       <w:pPr>
-        <w:spacing w:after="120" w:before="60"/>
+        <w:spacing w:after="60" w:before="70"/>
+      </w:pPr>
+      <w:r>
+        <w:rPr>
+          <w:sz w:val="21"/>
+          <w:szCs w:val="21"/>
+        </w:rPr>
+        <w:t xml:space="preserve">Five further candidates were tested and eliminated, each with a direct experiment rather than an inference:</w:t>
+      </w:r>
+    </w:p>
+    <w:p>
+      <w:pPr>
+        <w:pStyle w:val="ListParagraph"/>
+        <w:numPr>
+          <w:ilvl w:val="0"/>
+          <w:numId w:val="1"/>
+        </w:numPr>
+        <w:spacing w:after="70"/>
+      </w:pPr>
+      <w:r>
+        <w:rPr>
+          <w:sz w:val="21"/>
+          <w:szCs w:val="21"/>
+        </w:rPr>
+        <w:t xml:space="preserve">Module shadowing. The YOLOv5 repository uses the generic package names models and utils, which enter sys.modules on import. Removing them afterwards does not restore the isolated result.</w:t>
+      </w:r>
+    </w:p>
+    <w:p>
+      <w:pPr>
+        <w:pStyle w:val="ListParagraph"/>
+        <w:numPr>
+          <w:ilvl w:val="0"/>
+          <w:numId w:val="1"/>
+        </w:numPr>
+        <w:spacing w:after="70"/>
+      </w:pPr>
+      <w:r>
+        <w:rPr>
+          <w:sz w:val="21"/>
+          <w:szCs w:val="21"/>
+        </w:rPr>
+        <w:t xml:space="preserve">Environment variables. The import writes OMP_NUM_THREADS, NUMEXPR_MAX_THREADS and three logging variables. Setting all five by hand before importing torch, with no YOLOv5 import, leaves the result unchanged at the isolated value.</w:t>
+      </w:r>
+    </w:p>
+    <w:p>
+      <w:pPr>
+        <w:pStyle w:val="ListParagraph"/>
+        <w:numPr>
+          <w:ilvl w:val="0"/>
+          <w:numId w:val="1"/>
+        </w:numPr>
+        <w:spacing w:after="70"/>
+      </w:pPr>
+      <w:r>
+        <w:rPr>
+          <w:sz w:val="21"/>
+          <w:szCs w:val="21"/>
+        </w:rPr>
+        <w:t xml:space="preserve">Torch global flags. Thread counts, cuDNN benchmark and determinism, TF32 on both paths, float32 matmul precision, default dtype and gradient mode are byte-identical before and after the import.</w:t>
+      </w:r>
+    </w:p>
+    <w:p>
+      <w:pPr>
+        <w:pStyle w:val="ListParagraph"/>
+        <w:numPr>
+          <w:ilvl w:val="0"/>
+          <w:numId w:val="1"/>
+        </w:numPr>
+        <w:spacing w:after="70"/>
+      </w:pPr>
+      <w:r>
+        <w:rPr>
+          <w:sz w:val="21"/>
+          <w:szCs w:val="21"/>
+        </w:rPr>
+        <w:t xml:space="preserve">Non-maximum suppression. torchvision.ops.nms is the same function object before and after, so it has not been monkey-patched.</w:t>
+      </w:r>
+    </w:p>
+    <w:p>
+      <w:pPr>
+        <w:pStyle w:val="ListParagraph"/>
+        <w:numPr>
+          <w:ilvl w:val="0"/>
+          <w:numId w:val="1"/>
+        </w:numPr>
+        <w:spacing w:after="70"/>
+      </w:pPr>
+      <w:r>
+        <w:rPr>
+          <w:sz w:val="21"/>
+          <w:szCs w:val="21"/>
+        </w:rPr>
+        <w:t xml:space="preserve">Confidence threshold. Passing conf explicitly still shifts the result, so the library is not silently substituting a different threshold.</w:t>
+      </w:r>
+    </w:p>
+    <w:p>
+      <w:pPr>
+        <w:spacing w:after="120" w:before="70"/>
       </w:pPr>
       <w:r>
         <w:rPr>
@@ -11458,7 +11555,7 @@
           <w:sz w:val="21"/>
           <w:szCs w:val="21"/>
         </w:rPr>
-        <w:t xml:space="preserve">What this does not establish is which piece of global state the import leaves behind. The confidence threshold was also ruled out, since passing an explicit conf still shifts the result. Identifying the specific mechanism would require bisecting the YOLOv5 package imports, which was out of scope here. The finding should be read as: importing YOLOv5 is sufficient to change YOLO26 output. It is not a diagnosed root cause.</w:t>
+        <w:t xml:space="preserve">So the mechanism is still unidentified. The import pulls in 2,629 modules and one of them leaves state that the probes above do not reach; a plausible remaining candidate is a change in DLL search order, since importing the repository prepends an OpenCV binary directory to PATH, but testing that properly is a separate piece of work. The finding should therefore be read as a statement of sufficiency, that importing YOLOv5 is enough to change YOLO26 output, and not as a diagnosed root cause. It is reported because it affects reproducibility regardless of mechanism.</w:t>
       </w:r>
     </w:p>
     <w:p>

</xml_diff>

<commit_message>
Diagnose the YOLO26 ordering defect: ultralytics switches NMS on a sys.modules check
Bisected yolov5's import chain (step9e, step9f): only 'import torchvision'
reproduces the shift. ultralytics/utils/nms.py:152 selects torchvision.ops.nms
when torchvision is in sys.modules, else its own TorchNMS; the two disagree on
~6% of low-confidence boxes. Deleting torchvision from sys.modules after import
restores the isolated result, confirming the registry check is the switch.
Fix: import torchvision before YOLO26 inference.

Co-Authored-By: Claude Fable 5.1 <noreply@anthropic.com>
</commit_message>
<xml_diff>
--- a/pycasa_Testing_Report.docx
+++ b/pycasa_Testing_Report.docx
@@ -9797,7 +9797,7 @@
                 <w:sz w:val="19"/>
                 <w:szCs w:val="19"/>
               </w:rPr>
-              <w:t xml:space="preserve">YOLO26 results depend on run order</w:t>
+              <w:t xml:space="preserve">YOLO26 output depends on whether torchvision is imported</w:t>
             </w:r>
           </w:p>
         </w:tc>
@@ -9824,7 +9824,7 @@
                 <w:sz w:val="19"/>
                 <w:szCs w:val="19"/>
               </w:rPr>
-              <w:t xml:space="preserve">Importing the YOLOv5 modules changes YOLO26's low-confidence output; F1 shifts by about 3 points</w:t>
+              <w:t xml:space="preserve">ultralytics picks torchvision NMS or its own TorchNMS on a sys.modules check (utils/nms.py:152); the two disagree on about 6 percent of low-confidence boxes and F1 moves by about 3 points</w:t>
             </w:r>
           </w:p>
         </w:tc>
@@ -9851,7 +9851,7 @@
                 <w:sz w:val="19"/>
                 <w:szCs w:val="19"/>
               </w:rPr>
-              <w:t xml:space="preserve">Run each detector in a separate Python process</w:t>
+              <w:t xml:space="preserve">import torchvision before running YOLO26</w:t>
             </w:r>
           </w:p>
         </w:tc>
@@ -10433,19 +10433,71 @@
           <w:sz w:val="21"/>
           <w:szCs w:val="21"/>
         </w:rPr>
-        <w:t xml:space="preserve">YOLO26 returns different results depending on whether YOLOv5 ran earlier in the same Python process. This was narrowed down experimentally: merely importing the YOLOv5 repository modules is enough to change the outcome. OpenCV thread count and the confidence threshold were both ruled out as causes, so the import leaves global state that changes numerical behaviour.</w:t>
-      </w:r>
-    </w:p>
-    <w:p>
-      <w:pPr>
-        <w:spacing w:after="120" w:before="0"/>
-      </w:pPr>
-      <w:r>
-        <w:rPr>
+        <w:t xml:space="preserve">YOLO26 returns different results depending on whether YOLOv5 ran earlier in the same Python process. YOLOv5 turned out to be only the messenger. The actual trigger is a single import, and the mechanism is a specific line in the ultralytics package that pycasa depends on.</w:t>
+      </w:r>
+    </w:p>
+    <w:p>
+      <w:pPr>
+        <w:spacing w:after="40" w:before="80"/>
+      </w:pPr>
+      <w:r>
+        <w:rPr>
+          <w:b/>
+          <w:bCs/>
           <w:sz w:val="21"/>
           <w:szCs w:val="21"/>
         </w:rPr>
-        <w:t xml:space="preserve">The obvious candidate was OpenCV's thread count, which the YOLOv5 import drops from the default to one. That was tested directly rather than inferred, with a two-by-two design in which the import and the thread count were varied independently, each condition in its own process.</w:t>
+        <w:t xml:space="preserve">Root cause.</w:t>
+      </w:r>
+    </w:p>
+    <w:p>
+      <w:pPr>
+        <w:spacing w:after="120" w:before="0"/>
+      </w:pPr>
+      <w:r>
+        <w:rPr>
+          <w:sz w:val="21"/>
+          <w:szCs w:val="21"/>
+        </w:rPr>
+        <w:t xml:space="preserve">ultralytics selects its non-maximum-suppression implementation at call time, in utils/nms.py lines 151 to 157: if the name torchvision is present in sys.modules it calls torchvision.ops.nms, otherwise it falls back to its own pure-PyTorch TorchNMS.nms. The docstring states that TorchNMS matches torchvision behaviour exactly. The measurements below show that it does not. The YOLOv5 repository imports torchvision at the top of utils/general.py, so running YOLOv5 first flips every later YOLO26 call onto the torchvision path.</w:t>
+      </w:r>
+    </w:p>
+    <w:p>
+      <w:pPr>
+        <w:spacing w:after="120" w:before="0"/>
+      </w:pPr>
+      <w:r>
+        <w:rPr>
+          <w:sz w:val="21"/>
+          <w:szCs w:val="21"/>
+        </w:rPr>
+        <w:t xml:space="preserve">In an isolated pycasa run torchvision is never imported, which was verified by inspecting sys.modules before and after inference. So pycasa's default YOLO26 path uses the fallback NMS, and any other package that happens to import torchvision silently switches it to the reference one.</w:t>
+      </w:r>
+    </w:p>
+    <w:p>
+      <w:pPr>
+        <w:spacing w:after="40" w:before="80"/>
+      </w:pPr>
+      <w:r>
+        <w:rPr>
+          <w:b/>
+          <w:bCs/>
+          <w:sz w:val="21"/>
+          <w:szCs w:val="21"/>
+        </w:rPr>
+        <w:t xml:space="preserve">How it was found.</w:t>
+      </w:r>
+    </w:p>
+    <w:p>
+      <w:pPr>
+        <w:spacing w:after="120" w:before="0"/>
+      </w:pPr>
+      <w:r>
+        <w:rPr>
+          <w:sz w:val="21"/>
+          <w:szCs w:val="21"/>
+        </w:rPr>
+        <w:t xml:space="preserve">The obvious first candidate was OpenCV's thread count, which the YOLOv5 import drops to one. A two-by-two design varied the import and the thread count independently, each condition in its own process.</w:t>
       </w:r>
     </w:p>
     <w:tbl>
@@ -11444,118 +11496,33 @@
           <w:sz w:val="21"/>
           <w:szCs w:val="21"/>
         </w:rPr>
-        <w:t xml:space="preserve">Varying the thread count on its own changes nothing: A and B are identical, and so are C and D. Varying the import with the thread count held equal does change the result: B against D differs by 387 detections. True positives are 4,120 in all four conditions. Thread count is therefore not the mechanism, and the import is sufficient on its own.</w:t>
-      </w:r>
-    </w:p>
-    <w:p>
-      <w:pPr>
-        <w:spacing w:after="60" w:before="70"/>
-      </w:pPr>
-      <w:r>
-        <w:rPr>
+        <w:t xml:space="preserve">Thread count changes nothing on its own; the import does. Module shadowing, the five environment variables the import writes, every torch global flag, NMS monkey-patching and the confidence threshold were then each eliminated with a direct test. The import chain was bisected instead: of everything models/common.py imports, only utils/general.py reproduces the shift, and of everything utils/general.py does, only the bare statement import torchvision reproduces it. Two final runs settled the mechanism: with torchvision imported the result is 6,003 detections; importing it and then deleting it from sys.modules, with its libraries still loaded in memory, returns the result to 6,390. The switch is the registry check, not any numerical side effect of loading the package.</w:t>
+      </w:r>
+    </w:p>
+    <w:p>
+      <w:pPr>
+        <w:spacing w:after="40" w:before="80"/>
+      </w:pPr>
+      <w:r>
+        <w:rPr>
+          <w:b/>
+          <w:bCs/>
           <w:sz w:val="21"/>
           <w:szCs w:val="21"/>
         </w:rPr>
-        <w:t xml:space="preserve">Five further candidates were tested and eliminated, each with a direct experiment rather than an inference:</w:t>
-      </w:r>
-    </w:p>
-    <w:p>
-      <w:pPr>
-        <w:pStyle w:val="ListParagraph"/>
-        <w:numPr>
-          <w:ilvl w:val="0"/>
-          <w:numId w:val="1"/>
-        </w:numPr>
-        <w:spacing w:after="70"/>
+        <w:t xml:space="preserve">Fix.</w:t>
+      </w:r>
+    </w:p>
+    <w:p>
+      <w:pPr>
+        <w:spacing w:after="120" w:before="0"/>
       </w:pPr>
       <w:r>
         <w:rPr>
           <w:sz w:val="21"/>
           <w:szCs w:val="21"/>
         </w:rPr>
-        <w:t xml:space="preserve">Module shadowing. The YOLOv5 repository uses the generic package names models and utils, which enter sys.modules on import. Removing them afterwards does not restore the isolated result.</w:t>
-      </w:r>
-    </w:p>
-    <w:p>
-      <w:pPr>
-        <w:pStyle w:val="ListParagraph"/>
-        <w:numPr>
-          <w:ilvl w:val="0"/>
-          <w:numId w:val="1"/>
-        </w:numPr>
-        <w:spacing w:after="70"/>
-      </w:pPr>
-      <w:r>
-        <w:rPr>
-          <w:sz w:val="21"/>
-          <w:szCs w:val="21"/>
-        </w:rPr>
-        <w:t xml:space="preserve">Environment variables. The import writes OMP_NUM_THREADS, NUMEXPR_MAX_THREADS and three logging variables. Setting all five by hand before importing torch, with no YOLOv5 import, leaves the result unchanged at the isolated value.</w:t>
-      </w:r>
-    </w:p>
-    <w:p>
-      <w:pPr>
-        <w:pStyle w:val="ListParagraph"/>
-        <w:numPr>
-          <w:ilvl w:val="0"/>
-          <w:numId w:val="1"/>
-        </w:numPr>
-        <w:spacing w:after="70"/>
-      </w:pPr>
-      <w:r>
-        <w:rPr>
-          <w:sz w:val="21"/>
-          <w:szCs w:val="21"/>
-        </w:rPr>
-        <w:t xml:space="preserve">Torch global flags. Thread counts, cuDNN benchmark and determinism, TF32 on both paths, float32 matmul precision, default dtype and gradient mode are byte-identical before and after the import.</w:t>
-      </w:r>
-    </w:p>
-    <w:p>
-      <w:pPr>
-        <w:pStyle w:val="ListParagraph"/>
-        <w:numPr>
-          <w:ilvl w:val="0"/>
-          <w:numId w:val="1"/>
-        </w:numPr>
-        <w:spacing w:after="70"/>
-      </w:pPr>
-      <w:r>
-        <w:rPr>
-          <w:sz w:val="21"/>
-          <w:szCs w:val="21"/>
-        </w:rPr>
-        <w:t xml:space="preserve">Non-maximum suppression. torchvision.ops.nms is the same function object before and after, so it has not been monkey-patched.</w:t>
-      </w:r>
-    </w:p>
-    <w:p>
-      <w:pPr>
-        <w:pStyle w:val="ListParagraph"/>
-        <w:numPr>
-          <w:ilvl w:val="0"/>
-          <w:numId w:val="1"/>
-        </w:numPr>
-        <w:spacing w:after="70"/>
-      </w:pPr>
-      <w:r>
-        <w:rPr>
-          <w:sz w:val="21"/>
-          <w:szCs w:val="21"/>
-        </w:rPr>
-        <w:t xml:space="preserve">Confidence threshold. Passing conf explicitly still shifts the result, so the library is not silently substituting a different threshold.</w:t>
-      </w:r>
-    </w:p>
-    <w:p>
-      <w:pPr>
-        <w:spacing w:after="120" w:before="70"/>
-      </w:pPr>
-      <w:r>
-        <w:rPr>
-          <w:i/>
-          <w:iCs/>
-          <w:sz w:val="21"/>
-          <w:szCs w:val="21"/>
-        </w:rPr>
-        <w:t xml:space="preserve">So the mechanism is still unidentified. The import pulls in 2,629 modules and one of them leaves state that the probes above do not reach; a plausible remaining candidate is a change in DLL search order, since importing the repository prepends an OpenCV binary directory to PATH, but testing that properly is a separate piece of work. The finding should therefore be read as a statement of sufficiency, that importing YOLOv5 is enough to change YOLO26 output, and not as a diagnosed root cause. It is reported because it affects reproducibility regardless of mechanism.</w:t>
+        <w:t xml:space="preserve">For pycasa the fix is one line: import torchvision before running YOLO26, so that inference always uses the reference NMS regardless of what else the process has loaded. For ultralytics the equivalence claim in the TorchNMS docstring is false on this data and should be reported upstream. Until either lands, any published YOLO26 figure should state which NMS path produced it.</w:t>
       </w:r>
     </w:p>
     <w:p>
@@ -12631,7 +12598,7 @@
           <w:sz w:val="21"/>
           <w:szCs w:val="21"/>
         </w:rPr>
-        <w:t xml:space="preserve">The YOLO26 ordering defect makes benchmark numbers depend on run order. This is the highest-priority fix.</w:t>
+        <w:t xml:space="preserve">YOLO26 output depends on whether torchvision is loaded, because ultralytics switches NMS implementation on a sys.modules check. Import torchvision explicitly before inference; one line.</w:t>
       </w:r>
     </w:p>
     <w:p>

</xml_diff>